<commit_message>
Corrections de la revue éditoriale 1 appliquées (v2 du brouillon)
Bloquants : vitesses permises précisées (CN vs VIA), 1 090/1 431 km sourcés
du dépôt, 20,1 km, règle d'arrondi 3 h 23, ligne « sous 100 km/h » chiffrée
(41/18/0 km), en-têtes de table renommés. Majeurs : compte PN par scénario
en synthèse, « environ 5/28 points », définitions à première occurrence,
sections signalisation/PN inversées, citations Alto, aiguillages étiquetés,
conclusion raccourcie, notes de tables, espaces insécables (hors citations).

Co-Authored-By: Claude Fable 5 <noreply@anthropic.com>
Claude-Session: https://claude.ai/code/session_01UAqHM1ry5Ckx2YL5NLcNpH
</commit_message>
<xml_diff>
--- a/livrables/rapport_corridor_BROUILLON.docx
+++ b/livrables/rapport_corridor_BROUILLON.docx
@@ -48,7 +48,7 @@
         <w:pStyle w:val="FirstParagraph"/>
       </w:pPr>
       <w:r>
-        <w:t xml:space="preserve">Cette étude répond à une question simple : combien de temps le train peut-il prendre entre</w:t>
+        <w:t xml:space="preserve">Cette étude répond à une question simple : combien de temps le train peut-il prendre entre</w:t>
       </w:r>
       <w:r>
         <w:t xml:space="preserve"> </w:t>
@@ -66,7 +66,7 @@
         <w:t xml:space="preserve"> </w:t>
       </w:r>
       <w:r>
-        <w:t xml:space="preserve">que l’on peut compter : le temps que les courbes permettent, le temps des zones urbaines</w:t>
+        <w:t xml:space="preserve">que l’on peut compter : le temps que les courbes permettent, le temps des zones urbaines</w:t>
       </w:r>
       <w:r>
         <w:t xml:space="preserve"> </w:t>
@@ -86,7 +86,7 @@
         <w:pStyle w:val="BodyText"/>
       </w:pPr>
       <w:r>
-        <w:t xml:space="preserve">Trois scénarios de matériel et de voie (détail en section 3) :</w:t>
+        <w:t xml:space="preserve">Trois scénarios de matériel et de voie (détail en section 3) :</w:t>
       </w:r>
       <w:r>
         <w:t xml:space="preserve"> </w:t>
@@ -108,7 +108,7 @@
         <w:t xml:space="preserve"> </w:t>
       </w:r>
       <w:r>
-        <w:t xml:space="preserve">train d’aujourd’hui ;</w:t>
+        <w:t xml:space="preserve">train d’aujourd’hui ;</w:t>
       </w:r>
       <w:r>
         <w:t xml:space="preserve"> </w:t>
@@ -136,7 +136,7 @@
         <w:t xml:space="preserve"> </w:t>
       </w:r>
       <w:r>
-        <w:t xml:space="preserve">nécessaire) ;</w:t>
+        <w:t xml:space="preserve">nécessaire) ;</w:t>
       </w:r>
       <w:r>
         <w:t xml:space="preserve"> </w:t>
@@ -170,7 +170,7 @@
         <w:t xml:space="preserve"> </w:t>
       </w:r>
       <w:r>
-        <w:t xml:space="preserve">la signalisation ; 250 et plus exige de les éliminer, voir sections 5 et 6).</w:t>
+        <w:t xml:space="preserve">la signalisation ; 250 et plus exige de les éliminer, voir sections 5 et 6).</w:t>
       </w:r>
     </w:p>
     <w:p>
@@ -182,13 +182,25 @@
           <w:b/>
           <w:bCs/>
         </w:rPr>
-        <w:t xml:space="preserve">Temps Montréal-Toronto (539 km), en heures:minutes.</w:t>
-      </w:r>
-      <w:r>
-        <w:t xml:space="preserve"> </w:t>
-      </w:r>
-      <w:r>
-        <w:t xml:space="preserve">Horaire actuel : 5 h 18.</w:t>
+        <w:t xml:space="preserve">Temps Montréal-Toronto (539 km).</w:t>
+      </w:r>
+      <w:r>
+        <w:t xml:space="preserve"> </w:t>
+      </w:r>
+      <w:r>
+        <w:t xml:space="preserve">Horaire actuel : 5 h 18. Le « temps de base »</w:t>
+      </w:r>
+      <w:r>
+        <w:t xml:space="preserve"> </w:t>
+      </w:r>
+      <w:r>
+        <w:t xml:space="preserve">est le temps calculé sans marge (courbes + zones urbaines figées + arrêts) ; la</w:t>
+      </w:r>
+      <w:r>
+        <w:t xml:space="preserve"> </w:t>
+      </w:r>
+      <w:r>
+        <w:t xml:space="preserve">fourchette applique la marge, de la borne normative (9 %) à la marge actuelle du tronçon.</w:t>
       </w:r>
     </w:p>
     <w:tbl>
@@ -361,7 +373,7 @@
         <w:t xml:space="preserve"> </w:t>
       </w:r>
       <w:r>
-        <w:t xml:space="preserve">Horaire actuel : 3 h 22.</w:t>
+        <w:t xml:space="preserve">Horaire actuel : 3 h 23.</w:t>
       </w:r>
     </w:p>
     <w:tbl>
@@ -489,7 +501,7 @@
         <w:pStyle w:val="BodyText"/>
       </w:pPr>
       <w:r>
-        <w:t xml:space="preserve">La fourchette de marge n’est pas une estimation : sa borne basse est la marge normative</w:t>
+        <w:t xml:space="preserve">La fourchette de marge n’est pas une estimation : sa borne basse est la marge normative</w:t>
       </w:r>
       <w:r>
         <w:t xml:space="preserve"> </w:t>
@@ -535,7 +547,7 @@
         <w:t xml:space="preserve"> </w:t>
       </w:r>
       <w:r>
-        <w:t xml:space="preserve">aujourd’hui sur le tronçon concerné (mesurée dans cette étude : de 14 pour cent sur</w:t>
+        <w:t xml:space="preserve">aujourd’hui sur le tronçon concerné (mesurée dans cette étude : de 14 pour cent sur</w:t>
       </w:r>
       <w:r>
         <w:t xml:space="preserve"> </w:t>
@@ -547,7 +559,7 @@
         <w:t xml:space="preserve"> </w:t>
       </w:r>
       <w:r>
-        <w:t xml:space="preserve">est le coût du régime d’exploitation actuel ; la trancher est l’objet de l’étude de</w:t>
+        <w:t xml:space="preserve">est le coût du régime d’exploitation actuel ; la trancher est l’objet de l’étude de</w:t>
       </w:r>
       <w:r>
         <w:t xml:space="preserve"> </w:t>
@@ -561,7 +573,7 @@
         <w:pStyle w:val="BodyText"/>
       </w:pPr>
       <w:r>
-        <w:t xml:space="preserve">Mise en regard : le projet Alto propose environ 1 000 km de voies neuves dédiées pour</w:t>
+        <w:t xml:space="preserve">Mise en regard : le projet Alto propose environ 1 000 km de voies neuves dédiées pour</w:t>
       </w:r>
       <w:r>
         <w:t xml:space="preserve"> </w:t>
@@ -593,19 +605,19 @@
         <w:t xml:space="preserve"> </w:t>
       </w:r>
       <w:r>
-        <w:t xml:space="preserve">étude documente ce que les quelque 1 150 km de voies existantes du corridor riverain</w:t>
-      </w:r>
-      <w:r>
-        <w:t xml:space="preserve"> </w:t>
-      </w:r>
-      <w:r>
-        <w:t xml:space="preserve">peuvent donner, ainsi que les cinq obstacles qui les retiennent et le prix réglementaire</w:t>
-      </w:r>
-      <w:r>
-        <w:t xml:space="preserve"> </w:t>
-      </w:r>
-      <w:r>
-        <w:t xml:space="preserve">de chacun. Les deux exercices sont complémentaires : on ne peut comparer les options</w:t>
+        <w:t xml:space="preserve">étude documente ce que le réseau existant du corridor riverain (environ 1 090 km de</w:t>
+      </w:r>
+      <w:r>
+        <w:t xml:space="preserve"> </w:t>
+      </w:r>
+      <w:r>
+        <w:t xml:space="preserve">voies physiques, parcourues en 1 431 km de trajets) peut donner, ainsi que les cinq obstacles qui les retiennent et le prix réglementaire</w:t>
+      </w:r>
+      <w:r>
+        <w:t xml:space="preserve"> </w:t>
+      </w:r>
+      <w:r>
+        <w:t xml:space="preserve">de chacun. Les deux exercices sont complémentaires : on ne peut comparer les options</w:t>
       </w:r>
       <w:r>
         <w:t xml:space="preserve"> </w:t>
@@ -619,7 +631,7 @@
         <w:pStyle w:val="BodyText"/>
       </w:pPr>
       <w:r>
-        <w:t xml:space="preserve">Les cinq constats principaux :</w:t>
+        <w:t xml:space="preserve">Les cinq constats principaux :</w:t>
       </w:r>
     </w:p>
     <w:p>
@@ -692,16 +704,13 @@
         <w:t xml:space="preserve">200 km/h</w:t>
       </w:r>
       <w:r>
-        <w:t xml:space="preserve"> </w:t>
-      </w:r>
-      <w:r>
-        <w:t xml:space="preserve">: 754 des 924 passages du corridor se trouvent sur des segments dont la</w:t>
-      </w:r>
-      <w:r>
-        <w:t xml:space="preserve"> </w:t>
-      </w:r>
-      <w:r>
-        <w:t xml:space="preserve">géométrie dépasserait ce seuil ; le précédent américain y exige zéro passage</w:t>
+        <w:t xml:space="preserve"> : en scénario S3, 754 des 924 passages du corridor se trouvent sur des segments dont la</w:t>
+      </w:r>
+      <w:r>
+        <w:t xml:space="preserve"> </w:t>
+      </w:r>
+      <w:r>
+        <w:t xml:space="preserve">géométrie dépasserait ce seuil (695 en S2, 471 dès S1) ; le précédent américain y exige zéro passage</w:t>
       </w:r>
       <w:r>
         <w:t xml:space="preserve"> </w:t>
@@ -740,10 +749,7 @@
         <w:t xml:space="preserve">La signalisation est une ligne de devis, pas un mur</w:t>
       </w:r>
       <w:r>
-        <w:t xml:space="preserve"> </w:t>
-      </w:r>
-      <w:r>
-        <w:t xml:space="preserve">: rien à faire jusqu’à</w:t>
+        <w:t xml:space="preserve"> : rien à faire jusqu’à</w:t>
       </w:r>
       <w:r>
         <w:t xml:space="preserve"> </w:t>
@@ -803,19 +809,25 @@
         <w:t xml:space="preserve"> </w:t>
       </w:r>
       <w:r>
-        <w:t xml:space="preserve">horaires de VIA à géométrie neutralisée : une voie simple coûte 3 à 6 points de marge</w:t>
-      </w:r>
-      <w:r>
-        <w:t xml:space="preserve"> </w:t>
-      </w:r>
-      <w:r>
-        <w:t xml:space="preserve">quand VIA est propriétaire, 27 à 33 points quand le CN l’est. Le même instrument</w:t>
-      </w:r>
-      <w:r>
-        <w:t xml:space="preserve"> </w:t>
-      </w:r>
-      <w:r>
-        <w:t xml:space="preserve">montre ce que le doublement achète chez le CN : environ 28 points, soit une vingtaine</w:t>
+        <w:t xml:space="preserve">horaires de VIA à géométrie neutralisée : une voie simple coûte environ 5 points de marge</w:t>
+      </w:r>
+      <w:r>
+        <w:t xml:space="preserve"> </w:t>
+      </w:r>
+      <w:r>
+        <w:t xml:space="preserve">quand VIA est propriétaire, environ 28 points quand le CN l’est (stable de 3 à 6 et</w:t>
+      </w:r>
+      <w:r>
+        <w:t xml:space="preserve"> </w:t>
+      </w:r>
+      <w:r>
+        <w:t xml:space="preserve">de 27 à 33 selon la pénalité d’arrêt testée). Le même instrument</w:t>
+      </w:r>
+      <w:r>
+        <w:t xml:space="preserve"> </w:t>
+      </w:r>
+      <w:r>
+        <w:t xml:space="preserve">montre ce que le doublement achète chez le CN : environ 28 points, soit une vingtaine</w:t>
       </w:r>
       <w:r>
         <w:t xml:space="preserve"> </w:t>
@@ -855,7 +867,7 @@
         <w:t xml:space="preserve"> </w:t>
       </w:r>
       <w:r>
-        <w:t xml:space="preserve">selon la cellule) ; l’écart entre les deux est précisément ce qu’une étude de</w:t>
+        <w:t xml:space="preserve">selon la cellule) ; l’écart entre les deux est précisément ce qu’une étude de</w:t>
       </w:r>
       <w:r>
         <w:t xml:space="preserve"> </w:t>
@@ -894,7 +906,7 @@
         <w:t xml:space="preserve"> </w:t>
       </w:r>
       <w:r>
-        <w:t xml:space="preserve">la somme de quatre termes :</w:t>
+        <w:t xml:space="preserve">la somme de quatre termes :</w:t>
       </w:r>
     </w:p>
     <w:p>
@@ -1101,10 +1113,7 @@
         <w:t xml:space="preserve">Vitesse géométrique</w:t>
       </w:r>
       <w:r>
-        <w:t xml:space="preserve"> </w:t>
-      </w:r>
-      <w:r>
-        <w:t xml:space="preserve">: le plafond que les courbes permettent. Une courbe de rayon</w:t>
+        <w:t xml:space="preserve"> : le plafond que les courbes permettent. Une courbe de rayon</w:t>
       </w:r>
       <w:r>
         <w:t xml:space="preserve"> </w:t>
@@ -1228,10 +1237,7 @@
         <w:t xml:space="preserve">Vitesse commerciale</w:t>
       </w:r>
       <w:r>
-        <w:t xml:space="preserve"> </w:t>
-      </w:r>
-      <w:r>
-        <w:t xml:space="preserve">: la vitesse résultante à l’horaire, une fois appliqués les</w:t>
+        <w:t xml:space="preserve"> : la vitesse résultante à l’horaire, une fois appliqués les</w:t>
       </w:r>
       <w:r>
         <w:t xml:space="preserve"> </w:t>
@@ -1273,7 +1279,7 @@
         <w:t xml:space="preserve"> </w:t>
       </w:r>
       <w:r>
-        <w:t xml:space="preserve">soit le scénario : Montréal Central à Dorval (17,8 km), Montréal à Saint-Lambert par le</w:t>
+        <w:t xml:space="preserve">soit le scénario : Montréal Central à Dorval (17,8 km), Montréal à Saint-Lambert par le</w:t>
       </w:r>
       <w:r>
         <w:t xml:space="preserve"> </w:t>
@@ -1285,13 +1291,13 @@
         <w:t xml:space="preserve"> </w:t>
       </w:r>
       <w:r>
-        <w:t xml:space="preserve">(19,9 km), Guildwood à Toronto Union (20,2 km), chacun figé à la médiane des horaires</w:t>
-      </w:r>
-      <w:r>
-        <w:t xml:space="preserve"> </w:t>
-      </w:r>
-      <w:r>
-        <w:t xml:space="preserve">GTFS actuels</w:t>
+        <w:t xml:space="preserve">(19,9 km), Guildwood à Toronto Union (20,1 km), chacun figé à la médiane des horaires publiés</w:t>
+      </w:r>
+      <w:r>
+        <w:t xml:space="preserve"> </w:t>
+      </w:r>
+      <w:r>
+        <w:t xml:space="preserve">actuels (données ouvertes GTFS)</w:t>
       </w:r>
       <w:r>
         <w:t xml:space="preserve"> </w:t>
@@ -1311,10 +1317,7 @@
         <w:t xml:space="preserve">)</w:t>
       </w:r>
       <w:r>
-        <w:t xml:space="preserve"> </w:t>
-      </w:r>
-      <w:r>
-        <w:t xml:space="preserve">; Ottawa, sans gare d’approche proche, est traité par une</w:t>
+        <w:t xml:space="preserve"> ; Ottawa, sans gare d’approche proche, est traité par une</w:t>
       </w:r>
       <w:r>
         <w:t xml:space="preserve"> </w:t>
@@ -1350,7 +1353,7 @@
         <w:t xml:space="preserve"> </w:t>
       </w:r>
       <w:r>
-        <w:t xml:space="preserve">normalisation volontairement favorable : le pilote de train sans arrêt de septembre 2025</w:t>
+        <w:t xml:space="preserve">normalisation volontairement favorable : le pilote de train sans arrêt de septembre 2025</w:t>
       </w:r>
       <w:r>
         <w:t xml:space="preserve"> </w:t>
@@ -1400,7 +1403,7 @@
         <w:t xml:space="preserve"> </w:t>
       </w:r>
       <w:r>
-        <w:t xml:space="preserve">Jamais estimée : encadrée entre une borne normative et une borne mesurée</w:t>
+        <w:t xml:space="preserve">Jamais estimée : encadrée entre une borne normative et une borne mesurée</w:t>
       </w:r>
       <w:r>
         <w:t xml:space="preserve"> </w:t>
@@ -1424,7 +1427,7 @@
         <w:pStyle w:val="FirstParagraph"/>
       </w:pPr>
       <w:r>
-        <w:t xml:space="preserve">Géométrie : tracé VIA reconstruit par appariement des données d’horaire GTFS sur le</w:t>
+        <w:t xml:space="preserve">Géométrie : tracé VIA reconstruit par appariement des données d’horaires ouvertes de VIA (GTFS) sur le</w:t>
       </w:r>
       <w:r>
         <w:t xml:space="preserve"> </w:t>
@@ -1476,7 +1479,7 @@
         <w:t xml:space="preserve"> </w:t>
       </w:r>
       <w:r>
-        <w:t xml:space="preserve">indépendantes lors des phases antérieures du projet. Nombre de voies : détection</w:t>
+        <w:t xml:space="preserve">indépendantes lors des phases antérieures du projet. Nombre de voies : détection</w:t>
       </w:r>
       <w:r>
         <w:t xml:space="preserve"> </w:t>
@@ -1494,7 +1497,7 @@
         <w:t xml:space="preserve"> </w:t>
       </w:r>
       <w:r>
-        <w:t xml:space="preserve">tronçon documenté par le BST est de 0,1 km sur 25). Passages à niveau : inventaire</w:t>
+        <w:t xml:space="preserve">tronçon documenté par le BST est de 0,1 km sur 25). Passages à niveau : inventaire</w:t>
       </w:r>
       <w:r>
         <w:t xml:space="preserve"> </w:t>
@@ -1520,7 +1523,7 @@
         <w:t xml:space="preserve">)</w:t>
       </w:r>
       <w:r>
-        <w:t xml:space="preserve">. Horaires : flux GTFS de VIA,</w:t>
+        <w:t xml:space="preserve">. Horaires : flux GTFS de VIA,</w:t>
       </w:r>
       <w:r>
         <w:t xml:space="preserve"> </w:t>
@@ -1568,7 +1571,7 @@
         <w:t xml:space="preserve"> </w:t>
       </w:r>
       <w:r>
-        <w:t xml:space="preserve">à niveau (section 6) : les marges mesurées sont donc possiblement gonflées, ce qui est</w:t>
+        <w:t xml:space="preserve">à niveau (section 6) : les marges mesurées sont donc possiblement gonflées, ce qui est</w:t>
       </w:r>
       <w:r>
         <w:t xml:space="preserve"> </w:t>
@@ -1582,13 +1585,13 @@
         <w:pStyle w:val="BodyText"/>
       </w:pPr>
       <w:r>
-        <w:t xml:space="preserve">Règle d’écriture du document : des comptes et des seuils (« ce qui devrait être vrai »),</w:t>
-      </w:r>
-      <w:r>
-        <w:t xml:space="preserve"> </w:t>
-      </w:r>
-      <w:r>
-        <w:t xml:space="preserve">jamais des estimations d’auteur. On peut contester un coût ; on ne peut pas contester un</w:t>
+        <w:t xml:space="preserve">Règle d’écriture du document : des comptes et des seuils (« ce qui devrait être vrai »),</w:t>
+      </w:r>
+      <w:r>
+        <w:t xml:space="preserve"> </w:t>
+      </w:r>
+      <w:r>
+        <w:t xml:space="preserve">jamais des estimations d’auteur. On peut contester un coût ; on ne peut pas contester un</w:t>
       </w:r>
       <w:r>
         <w:t xml:space="preserve"> </w:t>
@@ -1619,7 +1622,7 @@
         <w:t xml:space="preserve"> </w:t>
       </w:r>
       <w:r>
-        <w:t xml:space="preserve">plus vite sans inconfort pour les passagers. Le Canada en a déjà exploité un : le LRC,</w:t>
+        <w:t xml:space="preserve">plus vite sans inconfort pour les passagers. Le Canada en a déjà exploité un : le LRC,</w:t>
       </w:r>
       <w:r>
         <w:t xml:space="preserve"> </w:t>
@@ -1679,7 +1682,7 @@
         <w:pStyle w:val="BodyText"/>
       </w:pPr>
       <w:r>
-        <w:t xml:space="preserve">Les trois scénarios :</w:t>
+        <w:t xml:space="preserve">Les trois scénarios :</w:t>
       </w:r>
     </w:p>
     <w:tbl>
@@ -1761,7 +1764,7 @@
               <w:pStyle w:val="Compact"/>
             </w:pPr>
             <w:r>
-              <w:t xml:space="preserve">S1 : voie et train actuels</w:t>
+              <w:t xml:space="preserve">S1 : voie et train actuels</w:t>
             </w:r>
           </w:p>
         </w:tc>
@@ -1818,7 +1821,7 @@
               <w:pStyle w:val="Compact"/>
             </w:pPr>
             <w:r>
-              <w:t xml:space="preserve">S2 : pendulaire type LRC</w:t>
+              <w:t xml:space="preserve">S2 : pendulaire type LRC</w:t>
             </w:r>
           </w:p>
         </w:tc>
@@ -1862,7 +1865,7 @@
               <w:pStyle w:val="Compact"/>
             </w:pPr>
             <w:r>
-              <w:t xml:space="preserve">100 % précédent CN</w:t>
+              <w:t xml:space="preserve">100 % précédent CN</w:t>
             </w:r>
           </w:p>
         </w:tc>
@@ -1875,7 +1878,7 @@
               <w:pStyle w:val="Compact"/>
             </w:pPr>
             <w:r>
-              <w:t xml:space="preserve">S3 : pendulaire moderne</w:t>
+              <w:t xml:space="preserve">S3 : pendulaire moderne</w:t>
             </w:r>
           </w:p>
         </w:tc>
@@ -1956,10 +1959,7 @@
         <w:t xml:space="preserve">)</w:t>
       </w:r>
       <w:r>
-        <w:t xml:space="preserve"> </w:t>
-      </w:r>
-      <w:r>
-        <w:t xml:space="preserve">: il ne demande aucune dérogation et n’exclut pas le fret. S1 porte</w:t>
+        <w:t xml:space="preserve"> : il ne demande aucune dérogation et n’exclut pas le fret. S1 porte</w:t>
       </w:r>
       <w:r>
         <w:t xml:space="preserve"> </w:t>
@@ -1986,7 +1986,7 @@
         <w:t xml:space="preserve"> </w:t>
       </w:r>
       <w:r>
-        <w:t xml:space="preserve">reste sous la cible (somme des quatre trajets analysés, 1 432 km) :</w:t>
+        <w:t xml:space="preserve">reste sous la cible (somme des quatre trajets analysés, 1 431 km) :</w:t>
       </w:r>
     </w:p>
     <w:tbl>
@@ -2059,7 +2059,7 @@
               <w:pStyle w:val="Compact"/>
             </w:pPr>
             <w:r>
-              <w:t xml:space="preserve">Sous 200 km/h (rectification requise pour HSR)</w:t>
+              <w:t xml:space="preserve">Sous 200 km/h (rectification requise pour la grande vitesse)</w:t>
             </w:r>
           </w:p>
         </w:tc>
@@ -2162,29 +2162,29 @@
               <w:pStyle w:val="Compact"/>
             </w:pPr>
             <w:r>
-              <w:t xml:space="preserve">présentes</w:t>
-            </w:r>
-          </w:p>
-        </w:tc>
-        <w:tc>
-          <w:tcPr/>
-          <w:p>
-            <w:pPr>
-              <w:pStyle w:val="Compact"/>
-            </w:pPr>
-            <w:r>
-              <w:t xml:space="preserve">résiduelles</w:t>
-            </w:r>
-          </w:p>
-        </w:tc>
-        <w:tc>
-          <w:tcPr/>
-          <w:p>
-            <w:pPr>
-              <w:pStyle w:val="Compact"/>
-            </w:pPr>
-            <w:r>
-              <w:t xml:space="preserve">zéro</w:t>
+              <w:t xml:space="preserve">41 km</w:t>
+            </w:r>
+          </w:p>
+        </w:tc>
+        <w:tc>
+          <w:tcPr/>
+          <w:p>
+            <w:pPr>
+              <w:pStyle w:val="Compact"/>
+            </w:pPr>
+            <w:r>
+              <w:t xml:space="preserve">18 km</w:t>
+            </w:r>
+          </w:p>
+        </w:tc>
+        <w:tc>
+          <w:tcPr/>
+          <w:p>
+            <w:pPr>
+              <w:pStyle w:val="Compact"/>
+            </w:pPr>
+            <w:r>
+              <w:t xml:space="preserve">0 km</w:t>
             </w:r>
           </w:p>
         </w:tc>
@@ -2195,7 +2195,7 @@
         <w:pStyle w:val="BodyText"/>
       </w:pPr>
       <w:r>
-        <w:t xml:space="preserve">La lecture décisionnelle : la géométrie du corridor n’a pas besoin d’être reconstruite,</w:t>
+        <w:t xml:space="preserve">La lecture décisionnelle : la géométrie du corridor n’a pas besoin d’être reconstruite,</w:t>
       </w:r>
       <w:r>
         <w:t xml:space="preserve"> </w:t>
@@ -2207,7 +2207,7 @@
         <w:t xml:space="preserve"> </w:t>
       </w:r>
       <w:r>
-        <w:t xml:space="preserve">sans toucher une seule courbe ; le résidu de 186 km est listé section par section dans</w:t>
+        <w:t xml:space="preserve">sans toucher une seule courbe ; le résidu de 186 km est listé section par section dans</w:t>
       </w:r>
       <w:r>
         <w:t xml:space="preserve"> </w:t>
@@ -2237,7 +2237,7 @@
         <w:t xml:space="preserve"> </w:t>
       </w:r>
       <w:r>
-        <w:t xml:space="preserve">Nord à 270 mm d’insuffisance ; la voie d’approbation existe (l’article 4.3 du règlement</w:t>
+        <w:t xml:space="preserve">Nord à 270 mm d’insuffisance ; la voie d’approbation existe (l’article 4.3 du règlement</w:t>
       </w:r>
       <w:r>
         <w:t xml:space="preserve"> </w:t>
@@ -2275,7 +2275,7 @@
         <w:t xml:space="preserve"> </w:t>
       </w:r>
       <w:r>
-        <w:t xml:space="preserve">dans les annexes. Par ailleurs, la caisse pendulaire protège le passager, pas le rail :</w:t>
+        <w:t xml:space="preserve">dans les annexes. Par ailleurs, la caisse pendulaire protège le passager, pas le rail :</w:t>
       </w:r>
       <w:r>
         <w:t xml:space="preserve"> </w:t>
@@ -2293,7 +2293,7 @@
         <w:t xml:space="preserve"> </w:t>
       </w:r>
       <w:r>
-        <w:t xml:space="preserve">L’histoire du LRC le rappelle : son système d’inclinaison, coûteux en entretien, a fini</w:t>
+        <w:t xml:space="preserve">L’histoire du LRC le rappelle : son système d’inclinaison, coûteux en entretien, a fini</w:t>
       </w:r>
       <w:r>
         <w:t xml:space="preserve"> </w:t>
@@ -2325,7 +2325,7 @@
         <w:t xml:space="preserve"> </w:t>
       </w:r>
       <w:r>
-        <w:t xml:space="preserve">l’argumentaire : tout y tient dans la méthode que le CN applique déjà.</w:t>
+        <w:t xml:space="preserve">l’argumentaire : tout y tient dans la méthode que le CN applique déjà.</w:t>
       </w:r>
     </w:p>
     <w:bookmarkEnd w:id="14"/>
@@ -2349,7 +2349,7 @@
         <w:t xml:space="preserve"> </w:t>
       </w:r>
       <w:r>
-        <w:t xml:space="preserve">corridor offre une expérience naturelle : des tronçons en voie simple appartenant à VIA</w:t>
+        <w:t xml:space="preserve">corridor offre une expérience naturelle : des tronçons en voie simple appartenant à VIA</w:t>
       </w:r>
       <w:r>
         <w:t xml:space="preserve"> </w:t>
@@ -2402,7 +2402,7 @@
         <w:t xml:space="preserve"> </w:t>
       </w:r>
       <w:r>
-        <w:t xml:space="preserve">temps à l’horaire (médiane de tous les sillons du GTFS) et le temps que la géométrie</w:t>
+        <w:t xml:space="preserve">temps à l’horaire (médiane de tous les sillons, un sillon étant le créneau horaire d’un train donné) et le temps que la géométrie</w:t>
       </w:r>
       <w:r>
         <w:t xml:space="preserve"> </w:t>
@@ -2432,7 +2432,7 @@
         <w:t xml:space="preserve"> </w:t>
       </w:r>
       <w:r>
-        <w:t xml:space="preserve">95 à 100 mi/h permis partout) :</w:t>
+        <w:t xml:space="preserve">95 à 100 mi/h, soit 153 à 161 km/h, permis sur les lignes du CN et 80 à 95 mi/h sur celles de VIA) :</w:t>
       </w:r>
     </w:p>
     <w:tbl>
@@ -2539,18 +2539,18 @@
               <w:pStyle w:val="Compact"/>
             </w:pPr>
             <w:r>
-              <w:t xml:space="preserve">37 %</w:t>
-            </w:r>
-          </w:p>
-        </w:tc>
-        <w:tc>
-          <w:tcPr/>
-          <w:p>
-            <w:pPr>
-              <w:pStyle w:val="Compact"/>
-            </w:pPr>
-            <w:r>
-              <w:t xml:space="preserve">5 %</w:t>
+              <w:t xml:space="preserve">37 %</w:t>
+            </w:r>
+          </w:p>
+        </w:tc>
+        <w:tc>
+          <w:tcPr/>
+          <w:p>
+            <w:pPr>
+              <w:pStyle w:val="Compact"/>
+            </w:pPr>
+            <w:r>
+              <w:t xml:space="preserve">5 %</w:t>
             </w:r>
           </w:p>
         </w:tc>
@@ -2596,18 +2596,18 @@
               <w:pStyle w:val="Compact"/>
             </w:pPr>
             <w:r>
-              <w:t xml:space="preserve">42 %</w:t>
-            </w:r>
-          </w:p>
-        </w:tc>
-        <w:tc>
-          <w:tcPr/>
-          <w:p>
-            <w:pPr>
-              <w:pStyle w:val="Compact"/>
-            </w:pPr>
-            <w:r>
-              <w:t xml:space="preserve">10 %</w:t>
+              <w:t xml:space="preserve">42 %</w:t>
+            </w:r>
+          </w:p>
+        </w:tc>
+        <w:tc>
+          <w:tcPr/>
+          <w:p>
+            <w:pPr>
+              <w:pStyle w:val="Compact"/>
+            </w:pPr>
+            <w:r>
+              <w:t xml:space="preserve">10 %</w:t>
             </w:r>
           </w:p>
         </w:tc>
@@ -2653,18 +2653,18 @@
               <w:pStyle w:val="Compact"/>
             </w:pPr>
             <w:r>
-              <w:t xml:space="preserve">65 %</w:t>
-            </w:r>
-          </w:p>
-        </w:tc>
-        <w:tc>
-          <w:tcPr/>
-          <w:p>
-            <w:pPr>
-              <w:pStyle w:val="Compact"/>
-            </w:pPr>
-            <w:r>
-              <w:t xml:space="preserve">21 %</w:t>
+              <w:t xml:space="preserve">65 %</w:t>
+            </w:r>
+          </w:p>
+        </w:tc>
+        <w:tc>
+          <w:tcPr/>
+          <w:p>
+            <w:pPr>
+              <w:pStyle w:val="Compact"/>
+            </w:pPr>
+            <w:r>
+              <w:t xml:space="preserve">21 %</w:t>
             </w:r>
           </w:p>
         </w:tc>
@@ -2686,7 +2686,7 @@
         <w:pStyle w:val="BodyText"/>
       </w:pPr>
       <w:r>
-        <w:t xml:space="preserve">Trois lignes, trois faits :</w:t>
+        <w:t xml:space="preserve">Trois lignes, trois faits :</w:t>
       </w:r>
     </w:p>
     <w:p>
@@ -2701,10 +2701,7 @@
         <w:t xml:space="preserve">Ce que le doublement achète, chez le CN</w:t>
       </w:r>
       <w:r>
-        <w:t xml:space="preserve"> </w:t>
-      </w:r>
-      <w:r>
-        <w:t xml:space="preserve">: environ 28 points de marge (65 contre 37),</w:t>
+        <w:t xml:space="preserve"> : environ 28 points de marge (65 contre 37),</w:t>
       </w:r>
       <w:r>
         <w:t xml:space="preserve"> </w:t>
@@ -2716,7 +2713,7 @@
         <w:t xml:space="preserve"> </w:t>
       </w:r>
       <w:r>
-        <w:t xml:space="preserve">mince (deux paires, celles du tronçon de Québec) : le chiffre se publie en fourchette,</w:t>
+        <w:t xml:space="preserve">mince (deux paires, celles du tronçon de Québec) : le chiffre se publie en fourchette,</w:t>
       </w:r>
       <w:r>
         <w:t xml:space="preserve"> </w:t>
@@ -2728,7 +2725,7 @@
         <w:t xml:space="preserve"> </w:t>
       </w:r>
       <w:r>
-        <w:t xml:space="preserve">vérifie dans la table : la classe de voie est la même que sur la ligne double (95 contre</w:t>
+        <w:t xml:space="preserve">vérifie dans la table : la classe de voie est la même que sur la ligne double (95 contre</w:t>
       </w:r>
       <w:r>
         <w:t xml:space="preserve"> </w:t>
@@ -2746,7 +2743,7 @@
         <w:t xml:space="preserve"> </w:t>
       </w:r>
       <w:r>
-        <w:t xml:space="preserve">n’expliquent l’écart ; les croisements l’expliquent.</w:t>
+        <w:t xml:space="preserve">n’expliquent l’écart ; les croisements l’expliquent.</w:t>
       </w:r>
     </w:p>
     <w:p>
@@ -2761,34 +2758,31 @@
         <w:t xml:space="preserve">Ce que le régime pèse</w:t>
       </w:r>
       <w:r>
-        <w:t xml:space="preserve"> </w:t>
-      </w:r>
-      <w:r>
-        <w:t xml:space="preserve">: sous propriétaire VIA, la voie simple ne coûte que 3 à</w:t>
-      </w:r>
-      <w:r>
-        <w:t xml:space="preserve"> </w:t>
-      </w:r>
-      <w:r>
-        <w:t xml:space="preserve">6 points de marge par rapport à la voie double du CN ; sous propriétaire CN, elle en</w:t>
-      </w:r>
-      <w:r>
-        <w:t xml:space="preserve"> </w:t>
-      </w:r>
-      <w:r>
-        <w:t xml:space="preserve">coûte 27 à 33. Le rapport est d’environ sept pour un, et il résiste aux tests de</w:t>
-      </w:r>
-      <w:r>
-        <w:t xml:space="preserve"> </w:t>
-      </w:r>
-      <w:r>
-        <w:t xml:space="preserve">sensibilité (pénalité d’arrêt de 0 à 3 minutes par paire). Une réserve honnête : les</w:t>
-      </w:r>
-      <w:r>
-        <w:t xml:space="preserve"> </w:t>
-      </w:r>
-      <w:r>
-        <w:t xml:space="preserve">lignes de VIA portent environ deux fois moins de trains que celles du CN ; ce qu’on</w:t>
+        <w:t xml:space="preserve"> : sous propriétaire VIA, la voie simple ne coûte qu’environ</w:t>
+      </w:r>
+      <w:r>
+        <w:t xml:space="preserve"> </w:t>
+      </w:r>
+      <w:r>
+        <w:t xml:space="preserve">5 points de marge par rapport à la voie double du CN ; sous propriétaire CN, elle en</w:t>
+      </w:r>
+      <w:r>
+        <w:t xml:space="preserve"> </w:t>
+      </w:r>
+      <w:r>
+        <w:t xml:space="preserve">coûte environ 28 (les fourchettes 3 à 6 et 27 à 33 couvrent les pénalités d’arrêt testées). Le rapport est d’environ sept pour un, et il résiste aux tests de</w:t>
+      </w:r>
+      <w:r>
+        <w:t xml:space="preserve"> </w:t>
+      </w:r>
+      <w:r>
+        <w:t xml:space="preserve">sensibilité (pénalité d’arrêt de 0 à 3 minutes par paire). Une réserve honnête : les</w:t>
+      </w:r>
+      <w:r>
+        <w:t xml:space="preserve"> </w:t>
+      </w:r>
+      <w:r>
+        <w:t xml:space="preserve">lignes de VIA portent environ deux fois moins de trains que celles du CN ; ce qu’on</w:t>
       </w:r>
       <w:r>
         <w:t xml:space="preserve"> </w:t>
@@ -2830,7 +2824,7 @@
         <w:t xml:space="preserve"> </w:t>
       </w:r>
       <w:r>
-        <w:t xml:space="preserve">l’horaire d’une même paire varie de 8 à 16 minutes selon le sillon : les croisements avec</w:t>
+        <w:t xml:space="preserve">l’horaire d’une même paire varie de 8 à 16 minutes selon le sillon : les croisements avec</w:t>
       </w:r>
       <w:r>
         <w:t xml:space="preserve"> </w:t>
@@ -2852,7 +2846,7 @@
         <w:pStyle w:val="Heading2"/>
       </w:pPr>
       <w:r>
-        <w:t xml:space="preserve">Contre-épreuve : le sud-ouest ontarien</w:t>
+        <w:t xml:space="preserve">Contre-épreuve : le sud-ouest ontarien</w:t>
       </w:r>
     </w:p>
     <w:p>
@@ -2872,13 +2866,13 @@
         <w:t xml:space="preserve"> </w:t>
       </w:r>
       <w:r>
-        <w:t xml:space="preserve">42 à 70 mi/h sur les lignes simples du CN : la marge y mesure d’abord l’état de la voie),</w:t>
-      </w:r>
-      <w:r>
-        <w:t xml:space="preserve"> </w:t>
-      </w:r>
-      <w:r>
-        <w:t xml:space="preserve">mais son contraste interne vaut la démonstration : le seul segment où le train roule à</w:t>
+        <w:t xml:space="preserve">42 à 70 mi/h sur les lignes simples du CN : la marge y mesure d’abord l’état de la voie),</w:t>
+      </w:r>
+      <w:r>
+        <w:t xml:space="preserve"> </w:t>
+      </w:r>
+      <w:r>
+        <w:t xml:space="preserve">mais son contraste interne vaut la démonstration : le seul segment où le train roule à</w:t>
       </w:r>
       <w:r>
         <w:t xml:space="preserve"> </w:t>
@@ -2902,7 +2896,7 @@
         <w:t xml:space="preserve"> </w:t>
       </w:r>
       <w:r>
-        <w:t xml:space="preserve">laissées à 42-70 mi/h. Le propriétaire qui vit du service passager entretient sa voie ;</w:t>
+        <w:t xml:space="preserve">laissées à 42-70 mi/h. Le propriétaire qui vit du service passager entretient sa voie ;</w:t>
       </w:r>
       <w:r>
         <w:t xml:space="preserve"> </w:t>
@@ -2926,7 +2920,7 @@
         <w:pStyle w:val="FirstParagraph"/>
       </w:pPr>
       <w:r>
-        <w:t xml:space="preserve">La marge d’horaire est la grandeur que cette étude ne peut pas trancher ; voici</w:t>
+        <w:t xml:space="preserve">La marge d’horaire est la grandeur que cette étude ne peut pas trancher ; voici</w:t>
       </w:r>
       <w:r>
         <w:t xml:space="preserve"> </w:t>
@@ -2956,7 +2950,7 @@
         <w:t xml:space="preserve"> </w:t>
       </w:r>
       <w:r>
-        <w:t xml:space="preserve">un supplément fixe plus un pourcentage selon la vitesse : au total environ 7 pour cent du</w:t>
+        <w:t xml:space="preserve">un supplément fixe plus un pourcentage selon la vitesse : au total environ 7 pour cent du</w:t>
       </w:r>
       <w:r>
         <w:t xml:space="preserve"> </w:t>
@@ -3002,7 +2996,7 @@
         <w:t xml:space="preserve"> </w:t>
       </w:r>
       <w:r>
-        <w:t xml:space="preserve">Les règles publiées des gestionnaires nationaux se situent au même ordre : SNCF Réseau</w:t>
+        <w:t xml:space="preserve">Les règles publiées des gestionnaires nationaux se situent au même ordre : SNCF Réseau</w:t>
       </w:r>
       <w:r>
         <w:t xml:space="preserve"> </w:t>
@@ -3034,16 +3028,13 @@
         <w:t xml:space="preserve">)</w:t>
       </w:r>
       <w:r>
-        <w:t xml:space="preserve"> </w:t>
-      </w:r>
-      <w:r>
-        <w:t xml:space="preserve">; le gestionnaire suédois publie même le différentiel qui nous</w:t>
-      </w:r>
-      <w:r>
-        <w:t xml:space="preserve"> </w:t>
-      </w:r>
-      <w:r>
-        <w:t xml:space="preserve">intéresse : 3 minutes par 100 km en voie simple contre 2 en voie double, plus 60 secondes</w:t>
+        <w:t xml:space="preserve"> ; le gestionnaire suédois publie même le différentiel qui nous</w:t>
+      </w:r>
+      <w:r>
+        <w:t xml:space="preserve"> </w:t>
+      </w:r>
+      <w:r>
+        <w:t xml:space="preserve">intéresse : 3 minutes par 100 km en voie simple contre 2 en voie double, plus 60 secondes</w:t>
       </w:r>
       <w:r>
         <w:t xml:space="preserve"> </w:t>
@@ -3099,7 +3090,7 @@
         <w:t xml:space="preserve"> </w:t>
       </w:r>
       <w:r>
-        <w:t xml:space="preserve">prudence d’horairiste : c’est le prix, en minutes, du régime de cohabitation actuel.</w:t>
+        <w:t xml:space="preserve">prudence d’horairiste : c’est le prix, en minutes, du régime de cohabitation actuel.</w:t>
       </w:r>
     </w:p>
     <w:p>
@@ -3123,7 +3114,7 @@
         <w:t xml:space="preserve"> </w:t>
       </w:r>
       <w:r>
-        <w:t xml:space="preserve">phénomène : environ 70 pour cent du temps additionnel des horaires d’Amtrak est</w:t>
+        <w:t xml:space="preserve">phénomène : environ 70 pour cent du temps additionnel des horaires d’Amtrak est</w:t>
       </w:r>
       <w:r>
         <w:t xml:space="preserve"> </w:t>
@@ -3182,19 +3173,19 @@
         <w:t xml:space="preserve">Pièces au dossier</w:t>
       </w:r>
       <w:r>
-        <w:t xml:space="preserve">, sans récit d’intention : le 11 octobre 2024, le CN a imposé aux</w:t>
-      </w:r>
-      <w:r>
-        <w:t xml:space="preserve"> </w:t>
-      </w:r>
-      <w:r>
-        <w:t xml:space="preserve">rames neuves de VIA un ralentissement à 72 km/h aux passages munis de prédicteurs</w:t>
-      </w:r>
-      <w:r>
-        <w:t xml:space="preserve"> </w:t>
-      </w:r>
-      <w:r>
-        <w:t xml:space="preserve">(304 passages visés), déclenchant des retards de 30 à 45 minutes ; VIA a demandé le</w:t>
+        <w:t xml:space="preserve">, sans récit d’intention : le 11 octobre 2024, le CN a imposé aux</w:t>
+      </w:r>
+      <w:r>
+        <w:t xml:space="preserve"> </w:t>
+      </w:r>
+      <w:r>
+        <w:t xml:space="preserve">rames neuves de VIA un ralentissement à 72 km/h aux passages munis de prédicteurs, les circuits qui déclenchent les barrières à</w:t>
+      </w:r>
+      <w:r>
+        <w:t xml:space="preserve"> </w:t>
+      </w:r>
+      <w:r>
+        <w:t xml:space="preserve">l’approche d’un train (304 passages visés), déclenchant des retards de 30 à 45 minutes ; VIA a demandé le</w:t>
       </w:r>
       <w:r>
         <w:t xml:space="preserve"> </w:t>
@@ -3220,10 +3211,7 @@
         <w:t xml:space="preserve">)</w:t>
       </w:r>
       <w:r>
-        <w:t xml:space="preserve"> </w:t>
-      </w:r>
-      <w:r>
-        <w:t xml:space="preserve">; l’ordre</w:t>
+        <w:t xml:space="preserve"> ; l’ordre</w:t>
       </w:r>
       <w:r>
         <w:t xml:space="preserve"> </w:t>
@@ -3357,13 +3345,19 @@
         <w:t xml:space="preserve"> </w:t>
       </w:r>
       <w:r>
-        <w:t xml:space="preserve">l’ajout de liaisons rapides entre les deux voies (un dépassement se règle à 15 mi/h ou à</w:t>
-      </w:r>
-      <w:r>
-        <w:t xml:space="preserve"> </w:t>
-      </w:r>
-      <w:r>
-        <w:t xml:space="preserve">45-50 mi/h selon l’aiguillage, ce qui change tout son coût en temps) et les sections de</w:t>
+        <w:t xml:space="preserve">l’ajout de liaisons rapides entre les deux voies (un dépassement se règle à basse ou à haute vitesse selon le type d’aiguillage</w:t>
+      </w:r>
+      <w:r>
+        <w:t xml:space="preserve"> </w:t>
+      </w:r>
+      <w:r>
+        <w:t xml:space="preserve">installé, ce qui change tout son coût en temps [ordres de grandeur 15 vs 45-50 mi/h,</w:t>
+      </w:r>
+      <w:r>
+        <w:t xml:space="preserve"> </w:t>
+      </w:r>
+      <w:r>
+        <w:t xml:space="preserve">À VÉRIFIER en étude de circulation]) et les sections de</w:t>
       </w:r>
       <w:r>
         <w:t xml:space="preserve"> </w:t>
@@ -3380,13 +3374,13 @@
     </w:p>
     <w:bookmarkEnd w:id="17"/>
     <w:bookmarkEnd w:id="18"/>
-    <w:bookmarkStart w:id="19" w:name="signalisation"/>
+    <w:bookmarkStart w:id="19" w:name="passages-à-niveau"/>
     <w:p>
       <w:pPr>
         <w:pStyle w:val="Heading1"/>
       </w:pPr>
       <w:r>
-        <w:t xml:space="preserve">Signalisation</w:t>
+        <w:t xml:space="preserve">Passages à niveau</w:t>
       </w:r>
     </w:p>
     <w:p>
@@ -3394,173 +3388,13 @@
         <w:pStyle w:val="FirstParagraph"/>
       </w:pPr>
       <w:r>
-        <w:t xml:space="preserve">La signalisation se traite en un escalier de trois marches, chacune étant un compte et</w:t>
-      </w:r>
-      <w:r>
-        <w:t xml:space="preserve"> </w:t>
-      </w:r>
-      <w:r>
-        <w:t xml:space="preserve">une ligne de devis, pas une carte :</w:t>
-      </w:r>
-    </w:p>
-    <w:p>
-      <w:pPr>
-        <w:pStyle w:val="Compact"/>
-        <w:numPr>
-          <w:ilvl w:val="0"/>
-          <w:numId w:val="1002"/>
-        </w:numPr>
-      </w:pPr>
-      <w:r>
-        <w:rPr>
-          <w:b/>
-          <w:bCs/>
-        </w:rPr>
-        <w:t xml:space="preserve">Jusqu’à 160 km/h : effet nul.</w:t>
-      </w:r>
-      <w:r>
-        <w:t xml:space="preserve"> </w:t>
-      </w:r>
-      <w:r>
-        <w:t xml:space="preserve">Le corridor s’exploite aujourd’hui en CTC à ces</w:t>
-      </w:r>
-      <w:r>
-        <w:t xml:space="preserve"> </w:t>
-      </w:r>
-      <w:r>
-        <w:t xml:space="preserve">vitesses ; il n’existe pas de règle canadienne imposant un plafond du type « 79 mi/h »</w:t>
-      </w:r>
-      <w:r>
-        <w:t xml:space="preserve"> </w:t>
-      </w:r>
-      <w:r>
-        <w:t xml:space="preserve">américain.</w:t>
-      </w:r>
-    </w:p>
-    <w:p>
-      <w:pPr>
-        <w:pStyle w:val="Compact"/>
-        <w:numPr>
-          <w:ilvl w:val="0"/>
-          <w:numId w:val="1002"/>
-        </w:numPr>
-      </w:pPr>
-      <w:r>
-        <w:rPr>
-          <w:b/>
-          <w:bCs/>
-        </w:rPr>
-        <w:t xml:space="preserve">De 161 à 200 km/h : superposition de contrôle en cabine.</w:t>
-      </w:r>
-      <w:r>
-        <w:t xml:space="preserve"> </w:t>
-      </w:r>
-      <w:r>
-        <w:t xml:space="preserve">Le précédent tarifé</w:t>
-      </w:r>
-      <w:r>
-        <w:t xml:space="preserve"> </w:t>
-      </w:r>
-      <w:r>
-        <w:t xml:space="preserve">existe : la ligne Amtrak du Michigan exploite 110 mi/h avec un système incrémental</w:t>
-      </w:r>
-      <w:r>
-        <w:t xml:space="preserve"> </w:t>
-      </w:r>
-      <w:r>
-        <w:t xml:space="preserve">superposé à la signalisation existante</w:t>
-      </w:r>
-      <w:r>
-        <w:t xml:space="preserve"> </w:t>
-      </w:r>
-      <w:r>
-        <w:t xml:space="preserve">(</w:t>
-      </w:r>
-      <w:hyperlink w:anchor="ref-fra2024itcs">
-        <w:r>
-          <w:rPr>
-            <w:rStyle w:val="Hyperlink"/>
-          </w:rPr>
-          <w:t xml:space="preserve">Federal Railroad Administration, 2024</w:t>
-        </w:r>
-      </w:hyperlink>
-      <w:r>
-        <w:t xml:space="preserve">)</w:t>
-      </w:r>
-      <w:r>
-        <w:t xml:space="preserve">.</w:t>
-      </w:r>
-    </w:p>
-    <w:p>
-      <w:pPr>
-        <w:pStyle w:val="Compact"/>
-        <w:numPr>
-          <w:ilvl w:val="0"/>
-          <w:numId w:val="1002"/>
-        </w:numPr>
-      </w:pPr>
-      <w:r>
-        <w:rPr>
-          <w:b/>
-          <w:bCs/>
-        </w:rPr>
-        <w:t xml:space="preserve">Au-delà de 200 km/h : contrôle intégral</w:t>
-      </w:r>
-      <w:r>
-        <w:t xml:space="preserve"> </w:t>
-      </w:r>
-      <w:r>
-        <w:t xml:space="preserve">de type ETCS. C’est le devis d’Alto, et</w:t>
-      </w:r>
-      <w:r>
-        <w:t xml:space="preserve"> </w:t>
-      </w:r>
-      <w:r>
-        <w:t xml:space="preserve">l’argument économique pour ne pas viser cette bande sur la voie partagée.</w:t>
-      </w:r>
-    </w:p>
-    <w:p>
-      <w:pPr>
-        <w:pStyle w:val="FirstParagraph"/>
-      </w:pPr>
-      <w:r>
-        <w:t xml:space="preserve">La signalisation a une seconde fonction, le débit (longueur des cantons, liaisons) : elle</w:t>
-      </w:r>
-      <w:r>
-        <w:t xml:space="preserve"> </w:t>
-      </w:r>
-      <w:r>
-        <w:t xml:space="preserve">vit dans le paquet capacité de l’étude de circulation, pas ici. Cette étude compte, elle</w:t>
-      </w:r>
-      <w:r>
-        <w:t xml:space="preserve"> </w:t>
-      </w:r>
-      <w:r>
-        <w:t xml:space="preserve">ne dimensionne pas.</w:t>
-      </w:r>
-    </w:p>
-    <w:bookmarkEnd w:id="19"/>
-    <w:bookmarkStart w:id="20" w:name="passages-à-niveau"/>
-    <w:p>
-      <w:pPr>
-        <w:pStyle w:val="Heading1"/>
-      </w:pPr>
-      <w:r>
-        <w:t xml:space="preserve">Passages à niveau</w:t>
-      </w:r>
-    </w:p>
-    <w:p>
-      <w:pPr>
-        <w:pStyle w:val="FirstParagraph"/>
-      </w:pPr>
-      <w:r>
         <w:t xml:space="preserve">Un passage à niveau est un croisement rail-route à niveau. Sa tolérance réglementaire</w:t>
       </w:r>
       <w:r>
         <w:t xml:space="preserve"> </w:t>
       </w:r>
       <w:r>
-        <w:t xml:space="preserve">décroît par paliers de vitesse ; le précédent nord-américain le plus structuré est</w:t>
+        <w:t xml:space="preserve">décroît par paliers de vitesse ; le précédent nord-américain le plus structuré est</w:t>
       </w:r>
       <w:r>
         <w:t xml:space="preserve"> </w:t>
@@ -3592,7 +3426,7 @@
         <w:t xml:space="preserve"> </w:t>
       </w:r>
       <w:r>
-        <w:t xml:space="preserve">au Canada :</w:t>
+        <w:t xml:space="preserve">au Canada :</w:t>
       </w:r>
     </w:p>
     <w:p>
@@ -3600,7 +3434,7 @@
         <w:pStyle w:val="Compact"/>
         <w:numPr>
           <w:ilvl w:val="0"/>
-          <w:numId w:val="1003"/>
+          <w:numId w:val="1002"/>
         </w:numPr>
       </w:pPr>
       <w:r>
@@ -3611,10 +3445,7 @@
         <w:t xml:space="preserve">jusqu’à 153 km/h</w:t>
       </w:r>
       <w:r>
-        <w:t xml:space="preserve"> </w:t>
-      </w:r>
-      <w:r>
-        <w:t xml:space="preserve">: régime actuel (le précédent domestique est le Turbo, plafonné</w:t>
+        <w:t xml:space="preserve"> : régime actuel (le précédent domestique est le Turbo, plafonné</w:t>
       </w:r>
       <w:r>
         <w:t xml:space="preserve"> </w:t>
@@ -3626,7 +3457,7 @@
         <w:t xml:space="preserve"> </w:t>
       </w:r>
       <w:r>
-        <w:t xml:space="preserve">à consolider :</w:t>
+        <w:t xml:space="preserve">à consolider :</w:t>
       </w:r>
       <w:r>
         <w:t xml:space="preserve"> </w:t>
@@ -3646,7 +3477,7 @@
         <w:t xml:space="preserve">)</w:t>
       </w:r>
       <w:r>
-        <w:t xml:space="preserve">]) ;</w:t>
+        <w:t xml:space="preserve">]) ;</w:t>
       </w:r>
     </w:p>
     <w:p>
@@ -3654,7 +3485,7 @@
         <w:pStyle w:val="Compact"/>
         <w:numPr>
           <w:ilvl w:val="0"/>
-          <w:numId w:val="1003"/>
+          <w:numId w:val="1002"/>
         </w:numPr>
       </w:pPr>
       <w:r>
@@ -3665,10 +3496,7 @@
         <w:t xml:space="preserve">154 à 177 km/h</w:t>
       </w:r>
       <w:r>
-        <w:t xml:space="preserve"> </w:t>
-      </w:r>
-      <w:r>
-        <w:t xml:space="preserve">: corridor « scellé » : traiter ou fermer chaque passage</w:t>
+        <w:t xml:space="preserve"> : corridor « scellé » : traiter ou fermer chaque passage</w:t>
       </w:r>
       <w:r>
         <w:t xml:space="preserve"> </w:t>
@@ -3680,7 +3508,7 @@
         <w:t xml:space="preserve"> </w:t>
       </w:r>
       <w:r>
-        <w:t xml:space="preserve">Caroline du Nord, a été évalué par la FRA : au moins 19 vies sauvées de 1995 à 2004 et</w:t>
+        <w:t xml:space="preserve">Caroline du Nord, a été évalué par la FRA : au moins 19 vies sauvées de 1995 à 2004 et</w:t>
       </w:r>
       <w:r>
         <w:t xml:space="preserve"> </w:t>
@@ -3706,10 +3534,7 @@
         <w:t xml:space="preserve">)</w:t>
       </w:r>
       <w:r>
-        <w:t xml:space="preserve"> </w:t>
-      </w:r>
-      <w:r>
-        <w:t xml:space="preserve">;</w:t>
+        <w:t xml:space="preserve"> ;</w:t>
       </w:r>
     </w:p>
     <w:p>
@@ -3717,7 +3542,7 @@
         <w:pStyle w:val="Compact"/>
         <w:numPr>
           <w:ilvl w:val="0"/>
-          <w:numId w:val="1003"/>
+          <w:numId w:val="1002"/>
         </w:numPr>
       </w:pPr>
       <w:r>
@@ -3728,16 +3553,13 @@
         <w:t xml:space="preserve">178 à 201 km/h</w:t>
       </w:r>
       <w:r>
-        <w:t xml:space="preserve"> </w:t>
-      </w:r>
-      <w:r>
-        <w:t xml:space="preserve">: système complet d’avertissement et de barrières approuvé et</w:t>
-      </w:r>
-      <w:r>
-        <w:t xml:space="preserve"> </w:t>
-      </w:r>
-      <w:r>
-        <w:t xml:space="preserve">fonctionnel (classe 7 américaine) ;</w:t>
+        <w:t xml:space="preserve"> : système complet d’avertissement et de barrières approuvé et</w:t>
+      </w:r>
+      <w:r>
+        <w:t xml:space="preserve"> </w:t>
+      </w:r>
+      <w:r>
+        <w:t xml:space="preserve">fonctionnel (classe 7 américaine) ;</w:t>
       </w:r>
     </w:p>
     <w:p>
@@ -3745,7 +3567,7 @@
         <w:pStyle w:val="Compact"/>
         <w:numPr>
           <w:ilvl w:val="0"/>
-          <w:numId w:val="1003"/>
+          <w:numId w:val="1002"/>
         </w:numPr>
       </w:pPr>
       <w:r>
@@ -3753,7 +3575,7 @@
           <w:b/>
           <w:bCs/>
         </w:rPr>
-        <w:t xml:space="preserve">au-delà de 201 km/h : zéro passage à niveau</w:t>
+        <w:t xml:space="preserve">au-delà de 201 km/h : zéro passage à niveau</w:t>
       </w:r>
       <w:r>
         <w:t xml:space="preserve"> </w:t>
@@ -3809,7 +3631,7 @@
         <w:t xml:space="preserve"> </w:t>
       </w:r>
       <w:r>
-        <w:t xml:space="preserve">352 passages publics à protection active : le même ordre de grandeur que les 304 passages</w:t>
+        <w:t xml:space="preserve">352 passages publics à protection active : le même ordre de grandeur que les 304 passages</w:t>
       </w:r>
       <w:r>
         <w:t xml:space="preserve"> </w:t>
@@ -3856,7 +3678,7 @@
         <w:t xml:space="preserve">Le compte par bande</w:t>
       </w:r>
       <w:r>
-        <w:t xml:space="preserve">, selon la vitesse que la géométrie permettrait en S3 :</w:t>
+        <w:t xml:space="preserve">, selon la vitesse que la géométrie permettrait en S3 :</w:t>
       </w:r>
     </w:p>
     <w:tbl>
@@ -3998,7 +3820,7 @@
         <w:pStyle w:val="BodyText"/>
       </w:pPr>
       <w:r>
-        <w:t xml:space="preserve">La lecture : si l’on veut exploiter la géométrie que le pendulaire libère, 754 passages</w:t>
+        <w:t xml:space="preserve">La lecture : si l’on veut exploiter la géométrie que le pendulaire libère, 754 passages</w:t>
       </w:r>
       <w:r>
         <w:t xml:space="preserve"> </w:t>
@@ -4025,25 +3847,211 @@
         <w:t xml:space="preserve">Le tri</w:t>
       </w:r>
       <w:r>
-        <w:t xml:space="preserve">, sur données ouvertes (le lecteur applique ses coûts unitaires) : 569 passages</w:t>
-      </w:r>
-      <w:r>
-        <w:t xml:space="preserve"> </w:t>
-      </w:r>
-      <w:r>
-        <w:t xml:space="preserve">privés ou de ferme, candidats à la fermeture [HYPOTHÈSE : l’existence d’une alternative</w:t>
-      </w:r>
-      <w:r>
-        <w:t xml:space="preserve"> </w:t>
-      </w:r>
-      <w:r>
-        <w:t xml:space="preserve">routière à moins de 2 km n’a pas été vérifiée] ; 233 passages municipaux simples,</w:t>
-      </w:r>
-      <w:r>
-        <w:t xml:space="preserve"> </w:t>
-      </w:r>
-      <w:r>
-        <w:t xml:space="preserve">traitement standard ; 122 passages urbains, multi-voies ou provinciaux, complexes.</w:t>
+        <w:t xml:space="preserve">, sur données ouvertes (le lecteur applique ses coûts unitaires) : 569 passages</w:t>
+      </w:r>
+      <w:r>
+        <w:t xml:space="preserve"> </w:t>
+      </w:r>
+      <w:r>
+        <w:t xml:space="preserve">privés ou de ferme, candidats à la fermeture [HYPOTHÈSE : l’existence d’une alternative</w:t>
+      </w:r>
+      <w:r>
+        <w:t xml:space="preserve"> </w:t>
+      </w:r>
+      <w:r>
+        <w:t xml:space="preserve">routière à moins de 2 km n’a pas été vérifiée] ; 233 passages municipaux simples,</w:t>
+      </w:r>
+      <w:r>
+        <w:t xml:space="preserve"> </w:t>
+      </w:r>
+      <w:r>
+        <w:t xml:space="preserve">traitement standard ; 122 passages urbains, multi-voies ou provinciaux, complexes.</w:t>
+      </w:r>
+    </w:p>
+    <w:bookmarkEnd w:id="19"/>
+    <w:bookmarkStart w:id="20" w:name="signalisation"/>
+    <w:p>
+      <w:pPr>
+        <w:pStyle w:val="Heading1"/>
+      </w:pPr>
+      <w:r>
+        <w:t xml:space="preserve">Signalisation</w:t>
+      </w:r>
+    </w:p>
+    <w:p>
+      <w:pPr>
+        <w:pStyle w:val="FirstParagraph"/>
+      </w:pPr>
+      <w:r>
+        <w:t xml:space="preserve">La signalisation se traite en un escalier de trois marches, chacune étant un compte et</w:t>
+      </w:r>
+      <w:r>
+        <w:t xml:space="preserve"> </w:t>
+      </w:r>
+      <w:r>
+        <w:t xml:space="preserve">une ligne de devis, pas une carte :</w:t>
+      </w:r>
+    </w:p>
+    <w:p>
+      <w:pPr>
+        <w:pStyle w:val="Compact"/>
+        <w:numPr>
+          <w:ilvl w:val="0"/>
+          <w:numId w:val="1003"/>
+        </w:numPr>
+      </w:pPr>
+      <w:r>
+        <w:rPr>
+          <w:b/>
+          <w:bCs/>
+        </w:rPr>
+        <w:t xml:space="preserve">Jusqu’à 160 km/h : effet nul.</w:t>
+      </w:r>
+      <w:r>
+        <w:t xml:space="preserve"> </w:t>
+      </w:r>
+      <w:r>
+        <w:t xml:space="preserve">Le corridor s’exploite déjà à 160 km/h sous sa signalisation actuelle (la commande</w:t>
+      </w:r>
+      <w:r>
+        <w:t xml:space="preserve"> </w:t>
+      </w:r>
+      <w:r>
+        <w:t xml:space="preserve">centralisée de la circulation, ou CTC), sans qu’aucune règle canadienne n’impose de</w:t>
+      </w:r>
+      <w:r>
+        <w:t xml:space="preserve"> </w:t>
+      </w:r>
+      <w:r>
+        <w:t xml:space="preserve">plafond du type « 79 mi/h » américain.</w:t>
+      </w:r>
+    </w:p>
+    <w:p>
+      <w:pPr>
+        <w:pStyle w:val="Compact"/>
+        <w:numPr>
+          <w:ilvl w:val="0"/>
+          <w:numId w:val="1003"/>
+        </w:numPr>
+      </w:pPr>
+      <w:r>
+        <w:rPr>
+          <w:b/>
+          <w:bCs/>
+        </w:rPr>
+        <w:t xml:space="preserve">De 161 à 200 km/h : superposition de contrôle en cabine.</w:t>
+      </w:r>
+      <w:r>
+        <w:t xml:space="preserve"> </w:t>
+      </w:r>
+      <w:r>
+        <w:t xml:space="preserve">Le précédent tarifé</w:t>
+      </w:r>
+      <w:r>
+        <w:t xml:space="preserve"> </w:t>
+      </w:r>
+      <w:r>
+        <w:t xml:space="preserve">existe : la ligne Amtrak du Michigan exploite 110 mi/h avec un système incrémental</w:t>
+      </w:r>
+      <w:r>
+        <w:t xml:space="preserve"> </w:t>
+      </w:r>
+      <w:r>
+        <w:t xml:space="preserve">superposé à la signalisation existante</w:t>
+      </w:r>
+      <w:r>
+        <w:t xml:space="preserve"> </w:t>
+      </w:r>
+      <w:r>
+        <w:t xml:space="preserve">(</w:t>
+      </w:r>
+      <w:hyperlink w:anchor="ref-fra2024itcs">
+        <w:r>
+          <w:rPr>
+            <w:rStyle w:val="Hyperlink"/>
+          </w:rPr>
+          <w:t xml:space="preserve">Federal Railroad Administration, 2024</w:t>
+        </w:r>
+      </w:hyperlink>
+      <w:r>
+        <w:t xml:space="preserve">)</w:t>
+      </w:r>
+      <w:r>
+        <w:t xml:space="preserve">.</w:t>
+      </w:r>
+    </w:p>
+    <w:p>
+      <w:pPr>
+        <w:pStyle w:val="Compact"/>
+        <w:numPr>
+          <w:ilvl w:val="0"/>
+          <w:numId w:val="1003"/>
+        </w:numPr>
+      </w:pPr>
+      <w:r>
+        <w:rPr>
+          <w:b/>
+          <w:bCs/>
+        </w:rPr>
+        <w:t xml:space="preserve">Au-delà de 200 km/h : contrôle intégral</w:t>
+      </w:r>
+      <w:r>
+        <w:t xml:space="preserve"> </w:t>
+      </w:r>
+      <w:r>
+        <w:t xml:space="preserve">de type ETCS (le standard européen de</w:t>
+      </w:r>
+      <w:r>
+        <w:t xml:space="preserve"> </w:t>
+      </w:r>
+      <w:r>
+        <w:t xml:space="preserve">contrôle des trains). C’est le devis d’Alto</w:t>
+      </w:r>
+      <w:r>
+        <w:t xml:space="preserve"> </w:t>
+      </w:r>
+      <w:r>
+        <w:t xml:space="preserve">(</w:t>
+      </w:r>
+      <w:hyperlink w:anchor="ref-alto2025">
+        <w:r>
+          <w:rPr>
+            <w:rStyle w:val="Hyperlink"/>
+          </w:rPr>
+          <w:t xml:space="preserve">Alto, 2025</w:t>
+        </w:r>
+      </w:hyperlink>
+      <w:r>
+        <w:t xml:space="preserve">)</w:t>
+      </w:r>
+      <w:r>
+        <w:t xml:space="preserve">, et</w:t>
+      </w:r>
+      <w:r>
+        <w:t xml:space="preserve"> </w:t>
+      </w:r>
+      <w:r>
+        <w:t xml:space="preserve">l’argument économique pour ne pas viser cette bande sur la voie partagée.</w:t>
+      </w:r>
+    </w:p>
+    <w:p>
+      <w:pPr>
+        <w:pStyle w:val="FirstParagraph"/>
+      </w:pPr>
+      <w:r>
+        <w:t xml:space="preserve">La signalisation a une seconde fonction, le débit (longueur des cantons, liaisons) : elle</w:t>
+      </w:r>
+      <w:r>
+        <w:t xml:space="preserve"> </w:t>
+      </w:r>
+      <w:r>
+        <w:t xml:space="preserve">vit dans le paquet capacité de l’étude de circulation, pas ici. Cette étude compte, elle</w:t>
+      </w:r>
+      <w:r>
+        <w:t xml:space="preserve"> </w:t>
+      </w:r>
+      <w:r>
+        <w:t xml:space="preserve">ne dimensionne pas.</w:t>
       </w:r>
     </w:p>
     <w:bookmarkEnd w:id="20"/>
@@ -4061,7 +4069,7 @@
         <w:pStyle w:val="FirstParagraph"/>
       </w:pPr>
       <w:r>
-        <w:t xml:space="preserve">Table complète des temps de base par tronçon, scénario et bande (sans marge ; la marge</w:t>
+        <w:t xml:space="preserve">Table complète des temps de base par tronçon, scénario et bande (sans marge ; la marge</w:t>
       </w:r>
       <w:r>
         <w:t xml:space="preserve"> </w:t>
@@ -4118,40 +4126,40 @@
               <w:pStyle w:val="Compact"/>
             </w:pPr>
             <w:r>
-              <w:t xml:space="preserve">S1@160</w:t>
-            </w:r>
-          </w:p>
-        </w:tc>
-        <w:tc>
-          <w:tcPr/>
-          <w:p>
-            <w:pPr>
-              <w:pStyle w:val="Compact"/>
-            </w:pPr>
-            <w:r>
-              <w:t xml:space="preserve">S2@200</w:t>
-            </w:r>
-          </w:p>
-        </w:tc>
-        <w:tc>
-          <w:tcPr/>
-          <w:p>
-            <w:pPr>
-              <w:pStyle w:val="Compact"/>
-            </w:pPr>
-            <w:r>
-              <w:t xml:space="preserve">S3@250</w:t>
-            </w:r>
-          </w:p>
-        </w:tc>
-        <w:tc>
-          <w:tcPr/>
-          <w:p>
-            <w:pPr>
-              <w:pStyle w:val="Compact"/>
-            </w:pPr>
-            <w:r>
-              <w:t xml:space="preserve">S3@300</w:t>
+              <w:t xml:space="preserve">S1, plafond 160</w:t>
+            </w:r>
+          </w:p>
+        </w:tc>
+        <w:tc>
+          <w:tcPr/>
+          <w:p>
+            <w:pPr>
+              <w:pStyle w:val="Compact"/>
+            </w:pPr>
+            <w:r>
+              <w:t xml:space="preserve">S2, 200</w:t>
+            </w:r>
+          </w:p>
+        </w:tc>
+        <w:tc>
+          <w:tcPr/>
+          <w:p>
+            <w:pPr>
+              <w:pStyle w:val="Compact"/>
+            </w:pPr>
+            <w:r>
+              <w:t xml:space="preserve">S3, 250</w:t>
+            </w:r>
+          </w:p>
+        </w:tc>
+        <w:tc>
+          <w:tcPr/>
+          <w:p>
+            <w:pPr>
+              <w:pStyle w:val="Compact"/>
+            </w:pPr>
+            <w:r>
+              <w:t xml:space="preserve">S3, 300</w:t>
             </w:r>
           </w:p>
         </w:tc>
@@ -4175,7 +4183,7 @@
               <w:pStyle w:val="Compact"/>
             </w:pPr>
             <w:r>
-              <w:t xml:space="preserve">3 h 22</w:t>
+              <w:t xml:space="preserve">3 h 23</w:t>
             </w:r>
           </w:p>
         </w:tc>
@@ -4434,7 +4442,7 @@
         <w:pStyle w:val="BodyText"/>
       </w:pPr>
       <w:r>
-        <w:t xml:space="preserve">Sensibilités : blocs urbains ±20 pour cent (déjà dans les fourchettes) ; le bruit sur les</w:t>
+        <w:t xml:space="preserve">Sensibilités : blocs urbains ±20 pour cent (déjà dans les fourchettes) ; le bruit sur les</w:t>
       </w:r>
       <w:r>
         <w:t xml:space="preserve"> </w:t>
@@ -4446,7 +4454,7 @@
         <w:t xml:space="preserve"> </w:t>
       </w:r>
       <w:r>
-        <w:t xml:space="preserve">km/h près ; la pénalité d’arrêt (5 minutes par arrêt, borne basse volontaire) peut être</w:t>
+        <w:t xml:space="preserve">km/h près ; la pénalité d’arrêt (5 minutes par arrêt, borne basse volontaire) peut être</w:t>
       </w:r>
       <w:r>
         <w:t xml:space="preserve"> </w:t>
@@ -4460,7 +4468,7 @@
         <w:pStyle w:val="BodyText"/>
       </w:pPr>
       <w:r>
-        <w:t xml:space="preserve">Deux garde-fous internes : chaque segment publié vérifie par construction la cohérence</w:t>
+        <w:t xml:space="preserve">Deux garde-fous internes : chaque segment publié vérifie par construction la cohérence</w:t>
       </w:r>
       <w:r>
         <w:t xml:space="preserve"> </w:t>
@@ -4496,7 +4504,7 @@
         <w:pStyle w:val="FirstParagraph"/>
       </w:pPr>
       <w:r>
-        <w:t xml:space="preserve">Ce que cette méthode ne voit pas, elle le déclare : elle ne simule pas la circulation</w:t>
+        <w:t xml:space="preserve">Ce que cette méthode ne voit pas, elle le déclare : elle ne simule pas la circulation</w:t>
       </w:r>
       <w:r>
         <w:t xml:space="preserve"> </w:t>
@@ -4514,7 +4522,7 @@
         <w:t xml:space="preserve"> </w:t>
       </w:r>
       <w:r>
-        <w:t xml:space="preserve">exceptionnelles, ce qui peut gonfler les marges mesurées ; la hiérarchie entre cellules</w:t>
+        <w:t xml:space="preserve">exceptionnelles, ce qui peut gonfler les marges mesurées ; la hiérarchie entre cellules</w:t>
       </w:r>
       <w:r>
         <w:t xml:space="preserve"> </w:t>
@@ -4534,7 +4542,7 @@
         <w:pStyle w:val="BodyText"/>
       </w:pPr>
       <w:r>
-        <w:t xml:space="preserve">C’est précisément pourquoi sa conclusion opérationnelle est une commande d’étude : une</w:t>
+        <w:t xml:space="preserve">C’est précisément pourquoi sa conclusion opérationnelle est une commande d’étude : une</w:t>
       </w:r>
       <w:r>
         <w:t xml:space="preserve"> </w:t>
@@ -4558,31 +4566,13 @@
         <w:t xml:space="preserve"> </w:t>
       </w:r>
       <w:r>
-        <w:t xml:space="preserve">d’évitements). Tout ce que la présente étude compte (les kilomètres sous plafond, les</w:t>
-      </w:r>
-      <w:r>
-        <w:t xml:space="preserve"> </w:t>
-      </w:r>
-      <w:r>
-        <w:t xml:space="preserve">passages par bande, les points de marge par cellule) est l’intrant direct de cette étude,</w:t>
-      </w:r>
-      <w:r>
-        <w:t xml:space="preserve"> </w:t>
-      </w:r>
-      <w:r>
-        <w:t xml:space="preserve">et en borne le résultat : le temps de parcours final tombera dans les fourchettes de la</w:t>
-      </w:r>
-      <w:r>
-        <w:t xml:space="preserve"> </w:t>
-      </w:r>
-      <w:r>
-        <w:t xml:space="preserve">synthèse, la seule question ouverte étant où, entre la borne normative et la borne</w:t>
-      </w:r>
-      <w:r>
-        <w:t xml:space="preserve"> </w:t>
-      </w:r>
-      <w:r>
-        <w:t xml:space="preserve">mesurée, le régime de cohabitation laissera atterrir la marge.</w:t>
+        <w:t xml:space="preserve">d’évitements). Tout ce que la présente étude compte en est l’intrant direct ; ses fourchettes en</w:t>
+      </w:r>
+      <w:r>
+        <w:t xml:space="preserve"> </w:t>
+      </w:r>
+      <w:r>
+        <w:t xml:space="preserve">bornent d’avance le résultat.</w:t>
       </w:r>
     </w:p>
     <w:bookmarkEnd w:id="22"/>

</xml_diff>

<commit_message>
Figure du 2×2 (carte des cellules voie × propriétaire) insérée au rapport
Script 23 : carte du cœur, palette catégorielle validée CVD (Okabe-Ito bleu/
vermillon/vert + gris neutre hors 2×2), marges médianes en légende, 300 dpi.
Toujours 11 pages.

Co-Authored-By: Claude Fable 5 <noreply@anthropic.com>
Claude-Session: https://claude.ai/code/session_01UAqHM1ry5Ckx2YL5NLcNpH
</commit_message>
<xml_diff>
--- a/livrables/rapport_corridor_BROUILLON.docx
+++ b/livrables/rapport_corridor_BROUILLON.docx
@@ -2329,7 +2329,7 @@
       </w:r>
     </w:p>
     <w:bookmarkEnd w:id="14"/>
-    <w:bookmarkStart w:id="18" w:name="X42a82ebb192afdbd87b7e7f59c353876bbe630b"/>
+    <w:bookmarkStart w:id="21" w:name="X42a82ebb192afdbd87b7e7f59c353876bbe630b"/>
     <w:p>
       <w:pPr>
         <w:pStyle w:val="Heading1"/>
@@ -2382,7 +2382,7 @@
         <w:t xml:space="preserve">et le prix du régime.</w:t>
       </w:r>
     </w:p>
-    <w:bookmarkStart w:id="15" w:name="la-mesure"/>
+    <w:bookmarkStart w:id="18" w:name="la-mesure"/>
     <w:p>
       <w:pPr>
         <w:pStyle w:val="Heading2"/>
@@ -2683,6 +2683,61 @@
     </w:tbl>
     <w:p>
       <w:pPr>
+        <w:pStyle w:val="CaptionedFigure"/>
+      </w:pPr>
+      <w:r>
+        <w:drawing>
+          <wp:inline>
+            <wp:extent cx="5334000" cy="3067855"/>
+            <wp:effectExtent b="0" l="0" r="0" t="0"/>
+            <wp:docPr descr="Le 2×2 du corridor : chaque inter-gare colorée selon sa cellule voie × propriétaire, avec la marge médiane mesurée par cellule. En gris, les paires exclues de la mesure (blocs urbains, ponts, frontières de propriétaire)." title="" id="16" name="Picture"/>
+            <a:graphic>
+              <a:graphicData uri="http://schemas.openxmlformats.org/drawingml/2006/picture">
+                <pic:pic>
+                  <pic:nvPicPr>
+                    <pic:cNvPr descr="livrables/figure_cellules.png" id="17" name="Picture"/>
+                    <pic:cNvPicPr>
+                      <a:picLocks noChangeArrowheads="1" noChangeAspect="1"/>
+                    </pic:cNvPicPr>
+                  </pic:nvPicPr>
+                  <pic:blipFill>
+                    <a:blip r:embed="rId15"/>
+                    <a:stretch>
+                      <a:fillRect/>
+                    </a:stretch>
+                  </pic:blipFill>
+                  <pic:spPr bwMode="auto">
+                    <a:xfrm>
+                      <a:off x="0" y="0"/>
+                      <a:ext cx="5334000" cy="3067855"/>
+                    </a:xfrm>
+                    <a:prstGeom prst="rect">
+                      <a:avLst/>
+                    </a:prstGeom>
+                    <a:noFill/>
+                    <a:ln w="9525">
+                      <a:noFill/>
+                      <a:headEnd/>
+                      <a:tailEnd/>
+                    </a:ln>
+                  </pic:spPr>
+                </pic:pic>
+              </a:graphicData>
+            </a:graphic>
+          </wp:inline>
+        </w:drawing>
+      </w:r>
+    </w:p>
+    <w:p>
+      <w:pPr>
+        <w:pStyle w:val="ImageCaption"/>
+      </w:pPr>
+      <w:r>
+        <w:t xml:space="preserve">Le 2×2 du corridor : chaque inter-gare colorée selon sa cellule voie × propriétaire, avec la marge médiane mesurée par cellule. En gris, les paires exclues de la mesure (blocs urbains, ponts, frontières de propriétaire).</w:t>
+      </w:r>
+    </w:p>
+    <w:p>
+      <w:pPr>
         <w:pStyle w:val="BodyText"/>
       </w:pPr>
       <w:r>
@@ -2839,8 +2894,8 @@
         <w:t xml:space="preserve">jusqu’à 24 minutes selon l’heure de son départ.</w:t>
       </w:r>
     </w:p>
-    <w:bookmarkEnd w:id="15"/>
-    <w:bookmarkStart w:id="16" w:name="contre-épreuve-le-sud-ouest-ontarien"/>
+    <w:bookmarkEnd w:id="18"/>
+    <w:bookmarkStart w:id="19" w:name="contre-épreuve-le-sud-ouest-ontarien"/>
     <w:p>
       <w:pPr>
         <w:pStyle w:val="Heading2"/>
@@ -2905,8 +2960,8 @@
         <w:t xml:space="preserve">la conclusion du cœur se réplique dans une seconde région, par un autre mécanisme.</w:t>
       </w:r>
     </w:p>
-    <w:bookmarkEnd w:id="16"/>
-    <w:bookmarkStart w:id="17" w:name="lencadrement-de-la-marge"/>
+    <w:bookmarkEnd w:id="19"/>
+    <w:bookmarkStart w:id="20" w:name="lencadrement-de-la-marge"/>
     <w:p>
       <w:pPr>
         <w:pStyle w:val="Heading2"/>
@@ -3372,9 +3427,9 @@
         <w:t xml:space="preserve">circulation.</w:t>
       </w:r>
     </w:p>
-    <w:bookmarkEnd w:id="17"/>
-    <w:bookmarkEnd w:id="18"/>
-    <w:bookmarkStart w:id="19" w:name="passages-à-niveau"/>
+    <w:bookmarkEnd w:id="20"/>
+    <w:bookmarkEnd w:id="21"/>
+    <w:bookmarkStart w:id="22" w:name="passages-à-niveau"/>
     <w:p>
       <w:pPr>
         <w:pStyle w:val="Heading1"/>
@@ -3868,8 +3923,8 @@
         <w:t xml:space="preserve">traitement standard ; 122 passages urbains, multi-voies ou provinciaux, complexes.</w:t>
       </w:r>
     </w:p>
-    <w:bookmarkEnd w:id="19"/>
-    <w:bookmarkStart w:id="20" w:name="signalisation"/>
+    <w:bookmarkEnd w:id="22"/>
+    <w:bookmarkStart w:id="23" w:name="signalisation"/>
     <w:p>
       <w:pPr>
         <w:pStyle w:val="Heading1"/>
@@ -4054,8 +4109,8 @@
         <w:t xml:space="preserve">ne dimensionne pas.</w:t>
       </w:r>
     </w:p>
-    <w:bookmarkEnd w:id="20"/>
-    <w:bookmarkStart w:id="21" w:name="résultats-intégrés"/>
+    <w:bookmarkEnd w:id="23"/>
+    <w:bookmarkStart w:id="24" w:name="résultats-intégrés"/>
     <w:p>
       <w:pPr>
         <w:pStyle w:val="Heading1"/>
@@ -4489,8 +4544,8 @@
         <w:t xml:space="preserve">correctement à chaque régénération.</w:t>
       </w:r>
     </w:p>
-    <w:bookmarkEnd w:id="21"/>
-    <w:bookmarkStart w:id="22" w:name="limites-et-létude-quil-faut-commander"/>
+    <w:bookmarkEnd w:id="24"/>
+    <w:bookmarkStart w:id="25" w:name="limites-et-létude-quil-faut-commander"/>
     <w:p>
       <w:pPr>
         <w:pStyle w:val="Heading1"/>
@@ -4575,8 +4630,8 @@
         <w:t xml:space="preserve">bornent d’avance le résultat.</w:t>
       </w:r>
     </w:p>
-    <w:bookmarkEnd w:id="22"/>
-    <w:bookmarkStart w:id="66" w:name="références"/>
+    <w:bookmarkEnd w:id="25"/>
+    <w:bookmarkStart w:id="69" w:name="références"/>
     <w:p>
       <w:pPr>
         <w:pStyle w:val="Heading1"/>
@@ -4585,8 +4640,8 @@
         <w:t xml:space="preserve">Références</w:t>
       </w:r>
     </w:p>
-    <w:bookmarkStart w:id="65" w:name="refs"/>
-    <w:bookmarkStart w:id="24" w:name="ref-alto2025"/>
+    <w:bookmarkStart w:id="68" w:name="refs"/>
+    <w:bookmarkStart w:id="27" w:name="ref-alto2025"/>
     <w:p>
       <w:pPr>
         <w:pStyle w:val="Bibliography"/>
@@ -4610,7 +4665,7 @@
       <w:r>
         <w:t xml:space="preserve"> </w:t>
       </w:r>
-      <w:hyperlink r:id="rId23">
+      <w:hyperlink r:id="rId26">
         <w:r>
           <w:rPr>
             <w:rStyle w:val="Hyperlink"/>
@@ -4619,8 +4674,8 @@
         </w:r>
       </w:hyperlink>
     </w:p>
-    <w:bookmarkEnd w:id="24"/>
-    <w:bookmarkStart w:id="26" w:name="ref-amtrakoig2019"/>
+    <w:bookmarkEnd w:id="27"/>
+    <w:bookmarkStart w:id="29" w:name="ref-amtrakoig2019"/>
     <w:p>
       <w:pPr>
         <w:pStyle w:val="Bibliography"/>
@@ -4647,7 +4702,7 @@
       <w:r>
         <w:t xml:space="preserve"> </w:t>
       </w:r>
-      <w:hyperlink r:id="rId25">
+      <w:hyperlink r:id="rId28">
         <w:r>
           <w:rPr>
             <w:rStyle w:val="Hyperlink"/>
@@ -4656,8 +4711,8 @@
         </w:r>
       </w:hyperlink>
     </w:p>
-    <w:bookmarkEnd w:id="26"/>
-    <w:bookmarkStart w:id="28" w:name="ref-bienaime2009sealed"/>
+    <w:bookmarkEnd w:id="29"/>
+    <w:bookmarkStart w:id="31" w:name="ref-bienaime2009sealed"/>
     <w:p>
       <w:pPr>
         <w:pStyle w:val="Bibliography"/>
@@ -4740,7 +4795,7 @@
       <w:r>
         <w:t xml:space="preserve"> </w:t>
       </w:r>
-      <w:hyperlink r:id="rId27">
+      <w:hyperlink r:id="rId30">
         <w:r>
           <w:rPr>
             <w:rStyle w:val="Hyperlink"/>
@@ -4749,8 +4804,8 @@
         </w:r>
       </w:hyperlink>
     </w:p>
-    <w:bookmarkEnd w:id="28"/>
-    <w:bookmarkStart w:id="29" w:name="ref-cn2002mr1305"/>
+    <w:bookmarkEnd w:id="31"/>
+    <w:bookmarkStart w:id="32" w:name="ref-cn2002mr1305"/>
     <w:p>
       <w:pPr>
         <w:pStyle w:val="Bibliography"/>
@@ -4775,8 +4830,8 @@
         <w:t xml:space="preserve">[Circulaire technique interne]. Compagnie des chemins de fer nationaux du Canada.</w:t>
       </w:r>
     </w:p>
-    <w:bookmarkEnd w:id="29"/>
-    <w:bookmarkStart w:id="31" w:name="ref-cbc2025pilote"/>
+    <w:bookmarkEnd w:id="32"/>
+    <w:bookmarkStart w:id="34" w:name="ref-cbc2025pilote"/>
     <w:p>
       <w:pPr>
         <w:pStyle w:val="Bibliography"/>
@@ -4828,7 +4883,7 @@
       <w:r>
         <w:t xml:space="preserve"> </w:t>
       </w:r>
-      <w:hyperlink r:id="rId30">
+      <w:hyperlink r:id="rId33">
         <w:r>
           <w:rPr>
             <w:rStyle w:val="Hyperlink"/>
@@ -4837,8 +4892,8 @@
         </w:r>
       </w:hyperlink>
     </w:p>
-    <w:bookmarkEnd w:id="31"/>
-    <w:bookmarkStart w:id="33" w:name="ref-ecfr213-347"/>
+    <w:bookmarkEnd w:id="34"/>
+    <w:bookmarkStart w:id="36" w:name="ref-ecfr213-347"/>
     <w:p>
       <w:pPr>
         <w:pStyle w:val="Bibliography"/>
@@ -4862,7 +4917,7 @@
       <w:r>
         <w:t xml:space="preserve"> </w:t>
       </w:r>
-      <w:hyperlink r:id="rId32">
+      <w:hyperlink r:id="rId35">
         <w:r>
           <w:rPr>
             <w:rStyle w:val="Hyperlink"/>
@@ -4871,8 +4926,8 @@
         </w:r>
       </w:hyperlink>
     </w:p>
-    <w:bookmarkEnd w:id="33"/>
-    <w:bookmarkStart w:id="35" w:name="ref-fra-lrc-152"/>
+    <w:bookmarkEnd w:id="36"/>
+    <w:bookmarkStart w:id="38" w:name="ref-fra-lrc-152"/>
     <w:p>
       <w:pPr>
         <w:pStyle w:val="Bibliography"/>
@@ -4896,7 +4951,7 @@
       <w:r>
         <w:t xml:space="preserve"> </w:t>
       </w:r>
-      <w:hyperlink r:id="rId34">
+      <w:hyperlink r:id="rId37">
         <w:r>
           <w:rPr>
             <w:rStyle w:val="Hyperlink"/>
@@ -4905,8 +4960,8 @@
         </w:r>
       </w:hyperlink>
     </w:p>
-    <w:bookmarkEnd w:id="35"/>
-    <w:bookmarkStart w:id="37" w:name="ref-fra2024itcs"/>
+    <w:bookmarkEnd w:id="38"/>
+    <w:bookmarkStart w:id="40" w:name="ref-fra2024itcs"/>
     <w:p>
       <w:pPr>
         <w:pStyle w:val="Bibliography"/>
@@ -4930,7 +4985,7 @@
       <w:r>
         <w:t xml:space="preserve"> </w:t>
       </w:r>
-      <w:hyperlink r:id="rId36">
+      <w:hyperlink r:id="rId39">
         <w:r>
           <w:rPr>
             <w:rStyle w:val="Hyperlink"/>
@@ -4939,8 +4994,8 @@
         </w:r>
       </w:hyperlink>
     </w:p>
-    <w:bookmarkEnd w:id="37"/>
-    <w:bookmarkStart w:id="39" w:name="ref-via2024requete"/>
+    <w:bookmarkEnd w:id="40"/>
+    <w:bookmarkStart w:id="42" w:name="ref-via2024requete"/>
     <w:p>
       <w:pPr>
         <w:pStyle w:val="Bibliography"/>
@@ -4992,7 +5047,7 @@
       <w:r>
         <w:t xml:space="preserve"> </w:t>
       </w:r>
-      <w:hyperlink r:id="rId38">
+      <w:hyperlink r:id="rId41">
         <w:r>
           <w:rPr>
             <w:rStyle w:val="Hyperlink"/>
@@ -5001,8 +5056,8 @@
         </w:r>
       </w:hyperlink>
     </w:p>
-    <w:bookmarkEnd w:id="39"/>
-    <w:bookmarkStart w:id="41" w:name="ref-osm2026geofabrik"/>
+    <w:bookmarkEnd w:id="42"/>
+    <w:bookmarkStart w:id="44" w:name="ref-osm2026geofabrik"/>
     <w:p>
       <w:pPr>
         <w:pStyle w:val="Bibliography"/>
@@ -5068,7 +5123,7 @@
       <w:r>
         <w:t xml:space="preserve"> </w:t>
       </w:r>
-      <w:hyperlink r:id="rId40">
+      <w:hyperlink r:id="rId43">
         <w:r>
           <w:rPr>
             <w:rStyle w:val="Hyperlink"/>
@@ -5077,8 +5132,8 @@
         </w:r>
       </w:hyperlink>
     </w:p>
-    <w:bookmarkEnd w:id="41"/>
-    <w:bookmarkStart w:id="43" w:name="ref-schittenhelm2011"/>
+    <w:bookmarkEnd w:id="44"/>
+    <w:bookmarkStart w:id="46" w:name="ref-schittenhelm2011"/>
     <w:p>
       <w:pPr>
         <w:pStyle w:val="Bibliography"/>
@@ -5102,7 +5157,7 @@
       <w:r>
         <w:t xml:space="preserve"> </w:t>
       </w:r>
-      <w:hyperlink r:id="rId42">
+      <w:hyperlink r:id="rId45">
         <w:r>
           <w:rPr>
             <w:rStyle w:val="Hyperlink"/>
@@ -5111,8 +5166,8 @@
         </w:r>
       </w:hyperlink>
     </w:p>
-    <w:bookmarkEnd w:id="43"/>
-    <w:bookmarkStart w:id="45" w:name="ref-sncf2023drr"/>
+    <w:bookmarkEnd w:id="46"/>
+    <w:bookmarkStart w:id="48" w:name="ref-sncf2023drr"/>
     <w:p>
       <w:pPr>
         <w:pStyle w:val="Bibliography"/>
@@ -5136,7 +5191,7 @@
       <w:r>
         <w:t xml:space="preserve"> </w:t>
       </w:r>
-      <w:hyperlink r:id="rId44">
+      <w:hyperlink r:id="rId47">
         <w:r>
           <w:rPr>
             <w:rStyle w:val="Hyperlink"/>
@@ -5145,8 +5200,8 @@
         </w:r>
       </w:hyperlink>
     </w:p>
-    <w:bookmarkEnd w:id="45"/>
-    <w:bookmarkStart w:id="47" w:name="ref-trafikverket2025jnb"/>
+    <w:bookmarkEnd w:id="48"/>
+    <w:bookmarkStart w:id="50" w:name="ref-trafikverket2025jnb"/>
     <w:p>
       <w:pPr>
         <w:pStyle w:val="Bibliography"/>
@@ -5170,7 +5225,7 @@
       <w:r>
         <w:t xml:space="preserve"> </w:t>
       </w:r>
-      <w:hyperlink r:id="rId46">
+      <w:hyperlink r:id="rId49">
         <w:r>
           <w:rPr>
             <w:rStyle w:val="Hyperlink"/>
@@ -5179,8 +5234,8 @@
         </w:r>
       </w:hyperlink>
     </w:p>
-    <w:bookmarkEnd w:id="47"/>
-    <w:bookmarkStart w:id="49" w:name="ref-tc2022rrts"/>
+    <w:bookmarkEnd w:id="50"/>
+    <w:bookmarkStart w:id="52" w:name="ref-tc2022rrts"/>
     <w:p>
       <w:pPr>
         <w:pStyle w:val="Bibliography"/>
@@ -5218,7 +5273,7 @@
       <w:r>
         <w:t xml:space="preserve"> </w:t>
       </w:r>
-      <w:hyperlink r:id="rId48">
+      <w:hyperlink r:id="rId51">
         <w:r>
           <w:rPr>
             <w:rStyle w:val="Hyperlink"/>
@@ -5227,8 +5282,8 @@
         </w:r>
       </w:hyperlink>
     </w:p>
-    <w:bookmarkEnd w:id="49"/>
-    <w:bookmarkStart w:id="51" w:name="ref-tc2023inventairepn"/>
+    <w:bookmarkEnd w:id="52"/>
+    <w:bookmarkStart w:id="54" w:name="ref-tc2023inventairepn"/>
     <w:p>
       <w:pPr>
         <w:pStyle w:val="Bibliography"/>
@@ -5252,7 +5307,7 @@
       <w:r>
         <w:t xml:space="preserve"> </w:t>
       </w:r>
-      <w:hyperlink r:id="rId50">
+      <w:hyperlink r:id="rId53">
         <w:r>
           <w:rPr>
             <w:rStyle w:val="Hyperlink"/>
@@ -5261,8 +5316,8 @@
         </w:r>
       </w:hyperlink>
     </w:p>
-    <w:bookmarkEnd w:id="51"/>
-    <w:bookmarkStart w:id="53" w:name="ref-tc2025gcp"/>
+    <w:bookmarkEnd w:id="54"/>
+    <w:bookmarkStart w:id="56" w:name="ref-tc2025gcp"/>
     <w:p>
       <w:pPr>
         <w:pStyle w:val="Bibliography"/>
@@ -5370,7 +5425,7 @@
       <w:r>
         <w:t xml:space="preserve"> </w:t>
       </w:r>
-      <w:hyperlink r:id="rId52">
+      <w:hyperlink r:id="rId55">
         <w:r>
           <w:rPr>
             <w:rStyle w:val="Hyperlink"/>
@@ -5379,8 +5434,8 @@
         </w:r>
       </w:hyperlink>
     </w:p>
-    <w:bookmarkEnd w:id="53"/>
-    <w:bookmarkStart w:id="54" w:name="ref-uic2000f451"/>
+    <w:bookmarkEnd w:id="56"/>
+    <w:bookmarkStart w:id="57" w:name="ref-uic2000f451"/>
     <w:p>
       <w:pPr>
         <w:pStyle w:val="Bibliography"/>
@@ -5405,8 +5460,8 @@
         <w:t xml:space="preserve">[Fiche UIC 451-1/F/4, 4e \'ed.]. UIC.</w:t>
       </w:r>
     </w:p>
-    <w:bookmarkEnd w:id="54"/>
-    <w:bookmarkStart w:id="56" w:name="ref-via2025rapportannuel"/>
+    <w:bookmarkEnd w:id="57"/>
+    <w:bookmarkStart w:id="59" w:name="ref-via2025rapportannuel"/>
     <w:p>
       <w:pPr>
         <w:pStyle w:val="Bibliography"/>
@@ -5430,7 +5485,7 @@
       <w:r>
         <w:t xml:space="preserve"> </w:t>
       </w:r>
-      <w:hyperlink r:id="rId55">
+      <w:hyperlink r:id="rId58">
         <w:r>
           <w:rPr>
             <w:rStyle w:val="Hyperlink"/>
@@ -5439,8 +5494,8 @@
         </w:r>
       </w:hyperlink>
     </w:p>
-    <w:bookmarkEnd w:id="56"/>
-    <w:bookmarkStart w:id="58" w:name="ref-via2025t1"/>
+    <w:bookmarkEnd w:id="59"/>
+    <w:bookmarkStart w:id="61" w:name="ref-via2025t1"/>
     <w:p>
       <w:pPr>
         <w:pStyle w:val="Bibliography"/>
@@ -5464,7 +5519,7 @@
       <w:r>
         <w:t xml:space="preserve"> </w:t>
       </w:r>
-      <w:hyperlink r:id="rId57">
+      <w:hyperlink r:id="rId60">
         <w:r>
           <w:rPr>
             <w:rStyle w:val="Hyperlink"/>
@@ -5473,8 +5528,8 @@
         </w:r>
       </w:hyperlink>
     </w:p>
-    <w:bookmarkEnd w:id="58"/>
-    <w:bookmarkStart w:id="60" w:name="ref-viarail2026gtfs"/>
+    <w:bookmarkEnd w:id="61"/>
+    <w:bookmarkStart w:id="63" w:name="ref-viarail2026gtfs"/>
     <w:p>
       <w:pPr>
         <w:pStyle w:val="Bibliography"/>
@@ -5540,7 +5595,7 @@
       <w:r>
         <w:t xml:space="preserve"> </w:t>
       </w:r>
-      <w:hyperlink r:id="rId59">
+      <w:hyperlink r:id="rId62">
         <w:r>
           <w:rPr>
             <w:rStyle w:val="Hyperlink"/>
@@ -5549,8 +5604,8 @@
         </w:r>
       </w:hyperlink>
     </w:p>
-    <w:bookmarkEnd w:id="60"/>
-    <w:bookmarkStart w:id="62" w:name="ref-wiki2025lrc"/>
+    <w:bookmarkEnd w:id="63"/>
+    <w:bookmarkStart w:id="65" w:name="ref-wiki2025lrc"/>
     <w:p>
       <w:pPr>
         <w:pStyle w:val="Bibliography"/>
@@ -5588,7 +5643,7 @@
       <w:r>
         <w:t xml:space="preserve"> </w:t>
       </w:r>
-      <w:hyperlink r:id="rId61">
+      <w:hyperlink r:id="rId64">
         <w:r>
           <w:rPr>
             <w:rStyle w:val="Hyperlink"/>
@@ -5597,8 +5652,8 @@
         </w:r>
       </w:hyperlink>
     </w:p>
-    <w:bookmarkEnd w:id="62"/>
-    <w:bookmarkStart w:id="64" w:name="ref-wiki2025turbo"/>
+    <w:bookmarkEnd w:id="65"/>
+    <w:bookmarkStart w:id="67" w:name="ref-wiki2025turbo"/>
     <w:p>
       <w:pPr>
         <w:pStyle w:val="Bibliography"/>
@@ -5622,7 +5677,7 @@
       <w:r>
         <w:t xml:space="preserve"> </w:t>
       </w:r>
-      <w:hyperlink r:id="rId63">
+      <w:hyperlink r:id="rId66">
         <w:r>
           <w:rPr>
             <w:rStyle w:val="Hyperlink"/>
@@ -5631,9 +5686,9 @@
         </w:r>
       </w:hyperlink>
     </w:p>
-    <w:bookmarkEnd w:id="64"/>
-    <w:bookmarkEnd w:id="65"/>
-    <w:bookmarkEnd w:id="66"/>
+    <w:bookmarkEnd w:id="67"/>
+    <w:bookmarkEnd w:id="68"/>
+    <w:bookmarkEnd w:id="69"/>
     <w:sectPr>
       <w:footnotePr>
         <w:numRestart w:val="eachSect"/>

</xml_diff>

<commit_message>
Dette purgée : robustesse GTFS 2023, sources Turbo/LRC consolidées, figure
Test de robustesse : 2×2 rejoué sur le flux VIA de janvier 2023 (Wayback,
pré-restrictions) : hiérarchie et niveaux quasi identiques (simple-CN 66,6 /
simple-VIA 48,7 / double-CN 36,3) : la structure précède la crise 2024-2025 ;
sorties marges_*_GTFS2023.csv, phrase de limites du rapport remplacée par le
résultat. Wikipédia remplacé : Turbo = Bateman 2015 + Canadian Rail 1976
(source d'époque : le record n'a pas amélioré le temps commercial) ; LRC =
VIA 2009 (retrait du tilt, formulation corrigée 2007-2009) + essais FRA 1982.
Registre et refs.bib à jour.

Co-Authored-By: Claude Fable 5 <noreply@anthropic.com>
Claude-Session: https://claude.ai/code/session_01UAqHM1ry5Ckx2YL5NLcNpH
</commit_message>
<xml_diff>
--- a/livrables/rapport_corridor_BROUILLON.docx
+++ b/livrables/rapport_corridor_BROUILLON.docx
@@ -2293,13 +2293,19 @@
         <w:t xml:space="preserve"> </w:t>
       </w:r>
       <w:r>
-        <w:t xml:space="preserve">L’histoire du LRC le rappelle : son système d’inclinaison, coûteux en entretien, a fini</w:t>
-      </w:r>
-      <w:r>
-        <w:t xml:space="preserve"> </w:t>
-      </w:r>
-      <w:r>
-        <w:t xml:space="preserve">désactivé puis retiré</w:t>
+        <w:t xml:space="preserve">L’histoire du LRC le rappelle : son système d’inclinaison, coûteux en entretien, a été retiré lors de la remise à</w:t>
+      </w:r>
+      <w:r>
+        <w:t xml:space="preserve"> </w:t>
+      </w:r>
+      <w:r>
+        <w:t xml:space="preserve">neuf de la flotte engagée à partir de 2007-2009, VIA justifiant ce retrait par la</w:t>
+      </w:r>
+      <w:r>
+        <w:t xml:space="preserve"> </w:t>
+      </w:r>
+      <w:r>
+        <w:t xml:space="preserve">réduction des coûts d’entretien et un allègement de deux tonnes par voiture</w:t>
       </w:r>
       <w:r>
         <w:t xml:space="preserve"> </w:t>
@@ -2307,12 +2313,12 @@
       <w:r>
         <w:t xml:space="preserve">(</w:t>
       </w:r>
-      <w:hyperlink w:anchor="ref-wiki2025lrc">
+      <w:hyperlink w:anchor="ref-via2009lrc">
         <w:r>
           <w:rPr>
             <w:rStyle w:val="Hyperlink"/>
           </w:rPr>
-          <w:t xml:space="preserve">Wikipédia, 2025a</w:t>
+          <w:t xml:space="preserve">VIA Rail Canada, 2009</w:t>
         </w:r>
       </w:hyperlink>
       <w:r>
@@ -3506,33 +3512,53 @@
         <w:t xml:space="preserve"> </w:t>
       </w:r>
       <w:r>
-        <w:t xml:space="preserve">en service à 153 km/h notamment à cause de ses passages à niveau [SOURCE tertiaire,</w:t>
-      </w:r>
-      <w:r>
-        <w:t xml:space="preserve"> </w:t>
-      </w:r>
-      <w:r>
-        <w:t xml:space="preserve">à consolider :</w:t>
-      </w:r>
-      <w:r>
-        <w:t xml:space="preserve"> </w:t>
-      </w:r>
-      <w:r>
-        <w:t xml:space="preserve">Wikipédia (</w:t>
-      </w:r>
-      <w:hyperlink w:anchor="ref-wiki2025turbo">
+        <w:t xml:space="preserve">en service à 153 km/h notamment à cause de ses quelque 300 passages à niveau</w:t>
+      </w:r>
+      <w:r>
+        <w:t xml:space="preserve"> </w:t>
+      </w:r>
+      <w:r>
+        <w:t xml:space="preserve">(</w:t>
+      </w:r>
+      <w:hyperlink w:anchor="ref-bateman2015">
         <w:r>
           <w:rPr>
             <w:rStyle w:val="Hyperlink"/>
           </w:rPr>
-          <w:t xml:space="preserve">2025b</w:t>
+          <w:t xml:space="preserve">Bateman, 2015</w:t>
         </w:r>
       </w:hyperlink>
       <w:r>
         <w:t xml:space="preserve">)</w:t>
       </w:r>
       <w:r>
-        <w:t xml:space="preserve">]) ;</w:t>
+        <w:t xml:space="preserve">, alors qu’il détenait le record canadien de 140,6 mi/h, établi en</w:t>
+      </w:r>
+      <w:r>
+        <w:t xml:space="preserve"> </w:t>
+      </w:r>
+      <w:r>
+        <w:t xml:space="preserve">conditions d’essai non reproductibles et sans effet sur le temps commercial</w:t>
+      </w:r>
+      <w:r>
+        <w:t xml:space="preserve"> </w:t>
+      </w:r>
+      <w:r>
+        <w:t xml:space="preserve">(</w:t>
+      </w:r>
+      <w:hyperlink w:anchor="ref-canadianrail1976">
+        <w:r>
+          <w:rPr>
+            <w:rStyle w:val="Hyperlink"/>
+          </w:rPr>
+          <w:t xml:space="preserve">Association canadienne d’histoire ferroviaire, 1976</w:t>
+        </w:r>
+      </w:hyperlink>
+      <w:r>
+        <w:t xml:space="preserve">)</w:t>
+      </w:r>
+      <w:r>
+        <w:t xml:space="preserve">) ;</w:t>
       </w:r>
     </w:p>
     <w:p>
@@ -4571,25 +4597,25 @@
         <w:t xml:space="preserve"> </w:t>
       </w:r>
       <w:r>
-        <w:t xml:space="preserve">elle ne chiffre aucun coût. Ses horaires de référence datent d’une saison de restrictions</w:t>
-      </w:r>
-      <w:r>
-        <w:t xml:space="preserve"> </w:t>
-      </w:r>
-      <w:r>
-        <w:t xml:space="preserve">exceptionnelles, ce qui peut gonfler les marges mesurées ; la hiérarchie entre cellules</w:t>
-      </w:r>
-      <w:r>
-        <w:t xml:space="preserve"> </w:t>
-      </w:r>
-      <w:r>
-        <w:t xml:space="preserve">(voie simple CN au-dessus de tout le reste) est robuste à ce biais, les niveaux absolus</w:t>
-      </w:r>
-      <w:r>
-        <w:t xml:space="preserve"> </w:t>
-      </w:r>
-      <w:r>
-        <w:t xml:space="preserve">moins.</w:t>
+        <w:t xml:space="preserve">elle ne chiffre aucun coût. Ses horaires de référence datent d’une saison de restrictions exceptionnelles ; le</w:t>
+      </w:r>
+      <w:r>
+        <w:t xml:space="preserve"> </w:t>
+      </w:r>
+      <w:r>
+        <w:t xml:space="preserve">biais a été testé en rejouant la mesure sur les horaires de janvier 2023, antérieurs à</w:t>
+      </w:r>
+      <w:r>
+        <w:t xml:space="preserve"> </w:t>
+      </w:r>
+      <w:r>
+        <w:t xml:space="preserve">la crise : la hiérarchie entre cellules et les niveaux de marge y sont pratiquement</w:t>
+      </w:r>
+      <w:r>
+        <w:t xml:space="preserve"> </w:t>
+      </w:r>
+      <w:r>
+        <w:t xml:space="preserve">identiques (voie simple CN à 67 pour cent dès 2023). La structure précède la crise.</w:t>
       </w:r>
     </w:p>
     <w:p>
@@ -4631,7 +4657,7 @@
       </w:r>
     </w:p>
     <w:bookmarkEnd w:id="25"/>
-    <w:bookmarkStart w:id="69" w:name="références"/>
+    <w:bookmarkStart w:id="71" w:name="références"/>
     <w:p>
       <w:pPr>
         <w:pStyle w:val="Heading1"/>
@@ -4640,7 +4666,7 @@
         <w:t xml:space="preserve">Références</w:t>
       </w:r>
     </w:p>
-    <w:bookmarkStart w:id="68" w:name="refs"/>
+    <w:bookmarkStart w:id="70" w:name="refs"/>
     <w:bookmarkStart w:id="27" w:name="ref-alto2025"/>
     <w:p>
       <w:pPr>
@@ -4712,13 +4738,13 @@
       </w:hyperlink>
     </w:p>
     <w:bookmarkEnd w:id="29"/>
-    <w:bookmarkStart w:id="31" w:name="ref-bienaime2009sealed"/>
+    <w:bookmarkStart w:id="31" w:name="ref-canadianrail1976"/>
     <w:p>
       <w:pPr>
         <w:pStyle w:val="Bibliography"/>
       </w:pPr>
       <w:r>
-        <w:t xml:space="preserve">Bien-Aime, P. (2009).</w:t>
+        <w:t xml:space="preserve">Association canadienne d’histoire ferroviaire. (1976). The business car.</w:t>
       </w:r>
       <w:r>
         <w:t xml:space="preserve"> </w:t>
@@ -4728,41 +4754,95 @@
           <w:i/>
           <w:iCs/>
         </w:rPr>
-        <w:t xml:space="preserve">North Carolina</w:t>
+        <w:t xml:space="preserve">Canadian Rail</w:t>
+      </w:r>
+      <w:r>
+        <w:t xml:space="preserve">, (296), 274.</w:t>
+      </w:r>
+      <w:r>
+        <w:t xml:space="preserve"> </w:t>
+      </w:r>
+      <w:hyperlink r:id="rId30">
+        <w:r>
+          <w:rPr>
+            <w:rStyle w:val="Hyperlink"/>
+          </w:rPr>
+          <w:t xml:space="preserve">https://exporail.org/canrail/canadian_rail_1962_1989/canadian-rail-296-1976.pdf</w:t>
+        </w:r>
+      </w:hyperlink>
+    </w:p>
+    <w:bookmarkEnd w:id="31"/>
+    <w:bookmarkStart w:id="33" w:name="ref-bateman2015"/>
+    <w:p>
+      <w:pPr>
+        <w:pStyle w:val="Bibliography"/>
+      </w:pPr>
+      <w:r>
+        <w:t xml:space="preserve">Bateman, C. (2015).</w:t>
+      </w:r>
+      <w:r>
+        <w:t xml:space="preserve"> </w:t>
       </w:r>
       <w:r>
         <w:rPr>
           <w:i/>
           <w:iCs/>
         </w:rPr>
-        <w:t xml:space="preserve"> </w:t>
+        <w:t xml:space="preserve">Remembering the ill-fated</w:t>
       </w:r>
       <w:r>
         <w:rPr>
           <w:i/>
           <w:iCs/>
         </w:rPr>
-        <w:t xml:space="preserve">«</w:t>
+        <w:t xml:space="preserve"> </w:t>
       </w:r>
       <w:r>
         <w:rPr>
           <w:i/>
           <w:iCs/>
         </w:rPr>
-        <w:t xml:space="preserve"> </w:t>
+        <w:t xml:space="preserve">CN</w:t>
       </w:r>
       <w:r>
         <w:rPr>
           <w:i/>
           <w:iCs/>
         </w:rPr>
-        <w:t xml:space="preserve">Sealed Corridor</w:t>
+        <w:t xml:space="preserve"> </w:t>
       </w:r>
       <w:r>
         <w:rPr>
           <w:i/>
           <w:iCs/>
         </w:rPr>
+        <w:t xml:space="preserve">Turbo train</w:t>
+      </w:r>
+      <w:r>
+        <w:t xml:space="preserve">. Spacing Toronto.</w:t>
+      </w:r>
+      <w:r>
+        <w:t xml:space="preserve"> </w:t>
+      </w:r>
+      <w:hyperlink r:id="rId32">
+        <w:r>
+          <w:rPr>
+            <w:rStyle w:val="Hyperlink"/>
+          </w:rPr>
+          <w:t xml:space="preserve">https://spacing.ca/toronto/2015/12/09/53711/</w:t>
+        </w:r>
+      </w:hyperlink>
+    </w:p>
+    <w:bookmarkEnd w:id="33"/>
+    <w:bookmarkStart w:id="35" w:name="ref-bienaime2009sealed"/>
+    <w:p>
+      <w:pPr>
+        <w:pStyle w:val="Bibliography"/>
+      </w:pPr>
+      <w:r>
+        <w:t xml:space="preserve">Bien-Aime, P. (2009).</w:t>
+      </w:r>
+      <w:r>
         <w:t xml:space="preserve"> </w:t>
       </w:r>
       <w:r>
@@ -4770,7 +4850,7 @@
           <w:i/>
           <w:iCs/>
         </w:rPr>
-        <w:t xml:space="preserve">»</w:t>
+        <w:t xml:space="preserve">North Carolina</w:t>
       </w:r>
       <w:r>
         <w:rPr>
@@ -4784,6 +4864,48 @@
           <w:i/>
           <w:iCs/>
         </w:rPr>
+        <w:t xml:space="preserve">«</w:t>
+      </w:r>
+      <w:r>
+        <w:rPr>
+          <w:i/>
+          <w:iCs/>
+        </w:rPr>
+        <w:t xml:space="preserve"> </w:t>
+      </w:r>
+      <w:r>
+        <w:rPr>
+          <w:i/>
+          <w:iCs/>
+        </w:rPr>
+        <w:t xml:space="preserve">Sealed Corridor</w:t>
+      </w:r>
+      <w:r>
+        <w:rPr>
+          <w:i/>
+          <w:iCs/>
+        </w:rPr>
+        <w:t xml:space="preserve"> </w:t>
+      </w:r>
+      <w:r>
+        <w:rPr>
+          <w:i/>
+          <w:iCs/>
+        </w:rPr>
+        <w:t xml:space="preserve">»</w:t>
+      </w:r>
+      <w:r>
+        <w:rPr>
+          <w:i/>
+          <w:iCs/>
+        </w:rPr>
+        <w:t xml:space="preserve"> </w:t>
+      </w:r>
+      <w:r>
+        <w:rPr>
+          <w:i/>
+          <w:iCs/>
+        </w:rPr>
         <w:t xml:space="preserve">Phase I, II, and III assessment</w:t>
       </w:r>
       <w:r>
@@ -4795,7 +4917,7 @@
       <w:r>
         <w:t xml:space="preserve"> </w:t>
       </w:r>
-      <w:hyperlink r:id="rId30">
+      <w:hyperlink r:id="rId34">
         <w:r>
           <w:rPr>
             <w:rStyle w:val="Hyperlink"/>
@@ -4804,8 +4926,8 @@
         </w:r>
       </w:hyperlink>
     </w:p>
-    <w:bookmarkEnd w:id="31"/>
-    <w:bookmarkStart w:id="32" w:name="ref-cn2002mr1305"/>
+    <w:bookmarkEnd w:id="35"/>
+    <w:bookmarkStart w:id="36" w:name="ref-cn2002mr1305"/>
     <w:p>
       <w:pPr>
         <w:pStyle w:val="Bibliography"/>
@@ -4830,8 +4952,8 @@
         <w:t xml:space="preserve">[Circulaire technique interne]. Compagnie des chemins de fer nationaux du Canada.</w:t>
       </w:r>
     </w:p>
-    <w:bookmarkEnd w:id="32"/>
-    <w:bookmarkStart w:id="34" w:name="ref-cbc2025pilote"/>
+    <w:bookmarkEnd w:id="36"/>
+    <w:bookmarkStart w:id="38" w:name="ref-cbc2025pilote"/>
     <w:p>
       <w:pPr>
         <w:pStyle w:val="Bibliography"/>
@@ -4883,7 +5005,7 @@
       <w:r>
         <w:t xml:space="preserve"> </w:t>
       </w:r>
-      <w:hyperlink r:id="rId33">
+      <w:hyperlink r:id="rId37">
         <w:r>
           <w:rPr>
             <w:rStyle w:val="Hyperlink"/>
@@ -4892,8 +5014,8 @@
         </w:r>
       </w:hyperlink>
     </w:p>
-    <w:bookmarkEnd w:id="34"/>
-    <w:bookmarkStart w:id="36" w:name="ref-ecfr213-347"/>
+    <w:bookmarkEnd w:id="38"/>
+    <w:bookmarkStart w:id="40" w:name="ref-ecfr213-347"/>
     <w:p>
       <w:pPr>
         <w:pStyle w:val="Bibliography"/>
@@ -4917,7 +5039,7 @@
       <w:r>
         <w:t xml:space="preserve"> </w:t>
       </w:r>
-      <w:hyperlink r:id="rId35">
+      <w:hyperlink r:id="rId39">
         <w:r>
           <w:rPr>
             <w:rStyle w:val="Hyperlink"/>
@@ -4926,8 +5048,8 @@
         </w:r>
       </w:hyperlink>
     </w:p>
-    <w:bookmarkEnd w:id="36"/>
-    <w:bookmarkStart w:id="38" w:name="ref-fra-lrc-152"/>
+    <w:bookmarkEnd w:id="40"/>
+    <w:bookmarkStart w:id="42" w:name="ref-fra-lrc-152"/>
     <w:p>
       <w:pPr>
         <w:pStyle w:val="Bibliography"/>
@@ -4951,7 +5073,7 @@
       <w:r>
         <w:t xml:space="preserve"> </w:t>
       </w:r>
-      <w:hyperlink r:id="rId37">
+      <w:hyperlink r:id="rId41">
         <w:r>
           <w:rPr>
             <w:rStyle w:val="Hyperlink"/>
@@ -4960,8 +5082,8 @@
         </w:r>
       </w:hyperlink>
     </w:p>
-    <w:bookmarkEnd w:id="38"/>
-    <w:bookmarkStart w:id="40" w:name="ref-fra2024itcs"/>
+    <w:bookmarkEnd w:id="42"/>
+    <w:bookmarkStart w:id="44" w:name="ref-fra2024itcs"/>
     <w:p>
       <w:pPr>
         <w:pStyle w:val="Bibliography"/>
@@ -4985,7 +5107,7 @@
       <w:r>
         <w:t xml:space="preserve"> </w:t>
       </w:r>
-      <w:hyperlink r:id="rId39">
+      <w:hyperlink r:id="rId43">
         <w:r>
           <w:rPr>
             <w:rStyle w:val="Hyperlink"/>
@@ -4994,8 +5116,8 @@
         </w:r>
       </w:hyperlink>
     </w:p>
-    <w:bookmarkEnd w:id="40"/>
-    <w:bookmarkStart w:id="42" w:name="ref-via2024requete"/>
+    <w:bookmarkEnd w:id="44"/>
+    <w:bookmarkStart w:id="46" w:name="ref-via2024requete"/>
     <w:p>
       <w:pPr>
         <w:pStyle w:val="Bibliography"/>
@@ -5047,7 +5169,7 @@
       <w:r>
         <w:t xml:space="preserve"> </w:t>
       </w:r>
-      <w:hyperlink r:id="rId41">
+      <w:hyperlink r:id="rId45">
         <w:r>
           <w:rPr>
             <w:rStyle w:val="Hyperlink"/>
@@ -5056,8 +5178,8 @@
         </w:r>
       </w:hyperlink>
     </w:p>
-    <w:bookmarkEnd w:id="42"/>
-    <w:bookmarkStart w:id="44" w:name="ref-osm2026geofabrik"/>
+    <w:bookmarkEnd w:id="46"/>
+    <w:bookmarkStart w:id="48" w:name="ref-osm2026geofabrik"/>
     <w:p>
       <w:pPr>
         <w:pStyle w:val="Bibliography"/>
@@ -5123,7 +5245,7 @@
       <w:r>
         <w:t xml:space="preserve"> </w:t>
       </w:r>
-      <w:hyperlink r:id="rId43">
+      <w:hyperlink r:id="rId47">
         <w:r>
           <w:rPr>
             <w:rStyle w:val="Hyperlink"/>
@@ -5132,8 +5254,8 @@
         </w:r>
       </w:hyperlink>
     </w:p>
-    <w:bookmarkEnd w:id="44"/>
-    <w:bookmarkStart w:id="46" w:name="ref-schittenhelm2011"/>
+    <w:bookmarkEnd w:id="48"/>
+    <w:bookmarkStart w:id="50" w:name="ref-schittenhelm2011"/>
     <w:p>
       <w:pPr>
         <w:pStyle w:val="Bibliography"/>
@@ -5157,7 +5279,7 @@
       <w:r>
         <w:t xml:space="preserve"> </w:t>
       </w:r>
-      <w:hyperlink r:id="rId45">
+      <w:hyperlink r:id="rId49">
         <w:r>
           <w:rPr>
             <w:rStyle w:val="Hyperlink"/>
@@ -5166,8 +5288,8 @@
         </w:r>
       </w:hyperlink>
     </w:p>
-    <w:bookmarkEnd w:id="46"/>
-    <w:bookmarkStart w:id="48" w:name="ref-sncf2023drr"/>
+    <w:bookmarkEnd w:id="50"/>
+    <w:bookmarkStart w:id="52" w:name="ref-sncf2023drr"/>
     <w:p>
       <w:pPr>
         <w:pStyle w:val="Bibliography"/>
@@ -5191,7 +5313,7 @@
       <w:r>
         <w:t xml:space="preserve"> </w:t>
       </w:r>
-      <w:hyperlink r:id="rId47">
+      <w:hyperlink r:id="rId51">
         <w:r>
           <w:rPr>
             <w:rStyle w:val="Hyperlink"/>
@@ -5200,8 +5322,8 @@
         </w:r>
       </w:hyperlink>
     </w:p>
-    <w:bookmarkEnd w:id="48"/>
-    <w:bookmarkStart w:id="50" w:name="ref-trafikverket2025jnb"/>
+    <w:bookmarkEnd w:id="52"/>
+    <w:bookmarkStart w:id="54" w:name="ref-trafikverket2025jnb"/>
     <w:p>
       <w:pPr>
         <w:pStyle w:val="Bibliography"/>
@@ -5225,7 +5347,7 @@
       <w:r>
         <w:t xml:space="preserve"> </w:t>
       </w:r>
-      <w:hyperlink r:id="rId49">
+      <w:hyperlink r:id="rId53">
         <w:r>
           <w:rPr>
             <w:rStyle w:val="Hyperlink"/>
@@ -5234,8 +5356,8 @@
         </w:r>
       </w:hyperlink>
     </w:p>
-    <w:bookmarkEnd w:id="50"/>
-    <w:bookmarkStart w:id="52" w:name="ref-tc2022rrts"/>
+    <w:bookmarkEnd w:id="54"/>
+    <w:bookmarkStart w:id="56" w:name="ref-tc2022rrts"/>
     <w:p>
       <w:pPr>
         <w:pStyle w:val="Bibliography"/>
@@ -5273,7 +5395,7 @@
       <w:r>
         <w:t xml:space="preserve"> </w:t>
       </w:r>
-      <w:hyperlink r:id="rId51">
+      <w:hyperlink r:id="rId55">
         <w:r>
           <w:rPr>
             <w:rStyle w:val="Hyperlink"/>
@@ -5282,8 +5404,8 @@
         </w:r>
       </w:hyperlink>
     </w:p>
-    <w:bookmarkEnd w:id="52"/>
-    <w:bookmarkStart w:id="54" w:name="ref-tc2023inventairepn"/>
+    <w:bookmarkEnd w:id="56"/>
+    <w:bookmarkStart w:id="58" w:name="ref-tc2023inventairepn"/>
     <w:p>
       <w:pPr>
         <w:pStyle w:val="Bibliography"/>
@@ -5307,7 +5429,7 @@
       <w:r>
         <w:t xml:space="preserve"> </w:t>
       </w:r>
-      <w:hyperlink r:id="rId53">
+      <w:hyperlink r:id="rId57">
         <w:r>
           <w:rPr>
             <w:rStyle w:val="Hyperlink"/>
@@ -5316,8 +5438,8 @@
         </w:r>
       </w:hyperlink>
     </w:p>
-    <w:bookmarkEnd w:id="54"/>
-    <w:bookmarkStart w:id="56" w:name="ref-tc2025gcp"/>
+    <w:bookmarkEnd w:id="58"/>
+    <w:bookmarkStart w:id="60" w:name="ref-tc2025gcp"/>
     <w:p>
       <w:pPr>
         <w:pStyle w:val="Bibliography"/>
@@ -5425,7 +5547,7 @@
       <w:r>
         <w:t xml:space="preserve"> </w:t>
       </w:r>
-      <w:hyperlink r:id="rId55">
+      <w:hyperlink r:id="rId59">
         <w:r>
           <w:rPr>
             <w:rStyle w:val="Hyperlink"/>
@@ -5434,8 +5556,8 @@
         </w:r>
       </w:hyperlink>
     </w:p>
-    <w:bookmarkEnd w:id="56"/>
-    <w:bookmarkStart w:id="57" w:name="ref-uic2000f451"/>
+    <w:bookmarkEnd w:id="60"/>
+    <w:bookmarkStart w:id="61" w:name="ref-uic2000f451"/>
     <w:p>
       <w:pPr>
         <w:pStyle w:val="Bibliography"/>
@@ -5460,14 +5582,14 @@
         <w:t xml:space="preserve">[Fiche UIC 451-1/F/4, 4e \'ed.]. UIC.</w:t>
       </w:r>
     </w:p>
-    <w:bookmarkEnd w:id="57"/>
-    <w:bookmarkStart w:id="59" w:name="ref-via2025rapportannuel"/>
+    <w:bookmarkEnd w:id="61"/>
+    <w:bookmarkStart w:id="63" w:name="ref-via2009lrc"/>
     <w:p>
       <w:pPr>
         <w:pStyle w:val="Bibliography"/>
       </w:pPr>
       <w:r>
-        <w:t xml:space="preserve">VIA Rail Canada. (2025a).</w:t>
+        <w:t xml:space="preserve">VIA Rail Canada. (2009).</w:t>
       </w:r>
       <w:r>
         <w:t xml:space="preserve"> </w:t>
@@ -5477,6 +5599,61 @@
           <w:i/>
           <w:iCs/>
         </w:rPr>
+        <w:t xml:space="preserve">An all-</w:t>
+      </w:r>
+      <w:r>
+        <w:rPr>
+          <w:i/>
+          <w:iCs/>
+        </w:rPr>
+        <w:t xml:space="preserve">Canadian</w:t>
+      </w:r>
+      <w:r>
+        <w:rPr>
+          <w:i/>
+          <w:iCs/>
+        </w:rPr>
+        <w:t xml:space="preserve"> </w:t>
+      </w:r>
+      <w:r>
+        <w:rPr>
+          <w:i/>
+          <w:iCs/>
+        </w:rPr>
+        <w:t xml:space="preserve">rail innovation from roof to wheels</w:t>
+      </w:r>
+      <w:r>
+        <w:t xml:space="preserve">. Document d’information.</w:t>
+      </w:r>
+      <w:r>
+        <w:t xml:space="preserve"> </w:t>
+      </w:r>
+      <w:hyperlink r:id="rId62">
+        <w:r>
+          <w:rPr>
+            <w:rStyle w:val="Hyperlink"/>
+          </w:rPr>
+          <w:t xml:space="preserve">https://www.viarail.ca/sites/all/files/media/pdfs/About_VIA/our-company/capital-investment-plan/BK090501E%20-%20VIA%20LRC.pdf</w:t>
+        </w:r>
+      </w:hyperlink>
+    </w:p>
+    <w:bookmarkEnd w:id="63"/>
+    <w:bookmarkStart w:id="65" w:name="ref-via2025rapportannuel"/>
+    <w:p>
+      <w:pPr>
+        <w:pStyle w:val="Bibliography"/>
+      </w:pPr>
+      <w:r>
+        <w:t xml:space="preserve">VIA Rail Canada. (2025a).</w:t>
+      </w:r>
+      <w:r>
+        <w:t xml:space="preserve"> </w:t>
+      </w:r>
+      <w:r>
+        <w:rPr>
+          <w:i/>
+          <w:iCs/>
+        </w:rPr>
         <w:t xml:space="preserve">Rapport annuel 2024</w:t>
       </w:r>
       <w:r>
@@ -5485,7 +5662,7 @@
       <w:r>
         <w:t xml:space="preserve"> </w:t>
       </w:r>
-      <w:hyperlink r:id="rId58">
+      <w:hyperlink r:id="rId64">
         <w:r>
           <w:rPr>
             <w:rStyle w:val="Hyperlink"/>
@@ -5494,8 +5671,8 @@
         </w:r>
       </w:hyperlink>
     </w:p>
-    <w:bookmarkEnd w:id="59"/>
-    <w:bookmarkStart w:id="61" w:name="ref-via2025t1"/>
+    <w:bookmarkEnd w:id="65"/>
+    <w:bookmarkStart w:id="67" w:name="ref-via2025t1"/>
     <w:p>
       <w:pPr>
         <w:pStyle w:val="Bibliography"/>
@@ -5519,7 +5696,7 @@
       <w:r>
         <w:t xml:space="preserve"> </w:t>
       </w:r>
-      <w:hyperlink r:id="rId60">
+      <w:hyperlink r:id="rId66">
         <w:r>
           <w:rPr>
             <w:rStyle w:val="Hyperlink"/>
@@ -5528,8 +5705,8 @@
         </w:r>
       </w:hyperlink>
     </w:p>
-    <w:bookmarkEnd w:id="61"/>
-    <w:bookmarkStart w:id="63" w:name="ref-viarail2026gtfs"/>
+    <w:bookmarkEnd w:id="67"/>
+    <w:bookmarkStart w:id="69" w:name="ref-viarail2026gtfs"/>
     <w:p>
       <w:pPr>
         <w:pStyle w:val="Bibliography"/>
@@ -5595,7 +5772,7 @@
       <w:r>
         <w:t xml:space="preserve"> </w:t>
       </w:r>
-      <w:hyperlink r:id="rId62">
+      <w:hyperlink r:id="rId68">
         <w:r>
           <w:rPr>
             <w:rStyle w:val="Hyperlink"/>
@@ -5604,91 +5781,9 @@
         </w:r>
       </w:hyperlink>
     </w:p>
-    <w:bookmarkEnd w:id="63"/>
-    <w:bookmarkStart w:id="65" w:name="ref-wiki2025lrc"/>
-    <w:p>
-      <w:pPr>
-        <w:pStyle w:val="Bibliography"/>
-      </w:pPr>
-      <w:r>
-        <w:t xml:space="preserve">Wikipédia. (2025a).</w:t>
-      </w:r>
-      <w:r>
-        <w:t xml:space="preserve"> </w:t>
-      </w:r>
-      <w:r>
-        <w:rPr>
-          <w:i/>
-          <w:iCs/>
-        </w:rPr>
-        <w:t xml:space="preserve">LRC</w:t>
-      </w:r>
-      <w:r>
-        <w:rPr>
-          <w:i/>
-          <w:iCs/>
-        </w:rPr>
-        <w:t xml:space="preserve"> </w:t>
-      </w:r>
-      <w:r>
-        <w:rPr>
-          <w:i/>
-          <w:iCs/>
-        </w:rPr>
-        <w:t xml:space="preserve">(train)</w:t>
-      </w:r>
-      <w:r>
-        <w:t xml:space="preserve">.</w:t>
-      </w:r>
-      <w:r>
-        <w:t xml:space="preserve"> </w:t>
-      </w:r>
-      <w:hyperlink r:id="rId64">
-        <w:r>
-          <w:rPr>
-            <w:rStyle w:val="Hyperlink"/>
-          </w:rPr>
-          <w:t xml:space="preserve">https://en.wikipedia.org/wiki/LRC_(train)</w:t>
-        </w:r>
-      </w:hyperlink>
-    </w:p>
-    <w:bookmarkEnd w:id="65"/>
-    <w:bookmarkStart w:id="67" w:name="ref-wiki2025turbo"/>
-    <w:p>
-      <w:pPr>
-        <w:pStyle w:val="Bibliography"/>
-      </w:pPr>
-      <w:r>
-        <w:t xml:space="preserve">Wikipédia. (2025b).</w:t>
-      </w:r>
-      <w:r>
-        <w:t xml:space="preserve"> </w:t>
-      </w:r>
-      <w:r>
-        <w:rPr>
-          <w:i/>
-          <w:iCs/>
-        </w:rPr>
-        <w:t xml:space="preserve">UAC TurboTrain</w:t>
-      </w:r>
-      <w:r>
-        <w:t xml:space="preserve">.</w:t>
-      </w:r>
-      <w:r>
-        <w:t xml:space="preserve"> </w:t>
-      </w:r>
-      <w:hyperlink r:id="rId66">
-        <w:r>
-          <w:rPr>
-            <w:rStyle w:val="Hyperlink"/>
-          </w:rPr>
-          <w:t xml:space="preserve">https://en.wikipedia.org/wiki/UAC_TurboTrain</w:t>
-        </w:r>
-      </w:hyperlink>
-    </w:p>
-    <w:bookmarkEnd w:id="67"/>
-    <w:bookmarkEnd w:id="68"/>
     <w:bookmarkEnd w:id="69"/>
+    <w:bookmarkEnd w:id="70"/>
+    <w:bookmarkEnd w:id="71"/>
     <w:sectPr>
       <w:footnotePr>
         <w:numRestart w:val="eachSect"/>

</xml_diff>

<commit_message>
S3 à la bande 200 ajouté partout (cohérence avec l'argumentaire anti->200)
Synthèse et résultats : ligne S3@200 en gras (3 h 58 MTL-TO, 2 h 08 MTL-QC,
1 h 31 MTL-Ott, 3 h 19 Ott-TO) = la combinaison cohérente avec le régime
réglementaire ; 250/300 étiquetées références (zéro passage + contrôle
intégral). Phrase d'interprétation ajoutée. Incohérence relevée par Vincent.

Co-Authored-By: Claude Fable 5 <noreply@anthropic.com>
Claude-Session: https://claude.ai/code/session_01UAqHM1ry5Ckx2YL5NLcNpH
</commit_message>
<xml_diff>
--- a/livrables/rapport_corridor_BROUILLON.docx
+++ b/livrables/rapport_corridor_BROUILLON.docx
@@ -201,6 +201,280 @@
       </w:r>
       <w:r>
         <w:t xml:space="preserve">fourchette applique la marge, de la borne normative (9 %) à la marge actuelle du tronçon.</w:t>
+      </w:r>
+    </w:p>
+    <w:tbl>
+      <w:tblPr>
+        <w:tblStyle w:val="Table"/>
+        <w:tblW w:type="pct" w:w="5000"/>
+        <w:tblLayout w:type="fixed"/>
+        <w:tblLook w:firstRow="1" w:lastRow="0" w:firstColumn="0" w:lastColumn="0" w:noHBand="0" w:noVBand="0" w:val="0020"/>
+      </w:tblPr>
+      <w:tblGrid>
+        <w:gridCol w:w="2640"/>
+        <w:gridCol w:w="2640"/>
+        <w:gridCol w:w="2640"/>
+      </w:tblGrid>
+      <w:tr>
+        <w:trPr>
+          <w:tblHeader w:val="on"/>
+        </w:trPr>
+        <w:tc>
+          <w:tcPr/>
+          <w:p>
+            <w:pPr>
+              <w:pStyle w:val="Compact"/>
+            </w:pPr>
+            <w:r>
+              <w:t xml:space="preserve">Scénario × bande</w:t>
+            </w:r>
+          </w:p>
+        </w:tc>
+        <w:tc>
+          <w:tcPr/>
+          <w:p>
+            <w:pPr>
+              <w:pStyle w:val="Compact"/>
+            </w:pPr>
+            <w:r>
+              <w:t xml:space="preserve">Temps de base</w:t>
+            </w:r>
+          </w:p>
+        </w:tc>
+        <w:tc>
+          <w:tcPr/>
+          <w:p>
+            <w:pPr>
+              <w:pStyle w:val="Compact"/>
+            </w:pPr>
+            <w:r>
+              <w:t xml:space="preserve">Avec marge (fourchette)</w:t>
+            </w:r>
+          </w:p>
+        </w:tc>
+      </w:tr>
+      <w:tr>
+        <w:tc>
+          <w:tcPr/>
+          <w:p>
+            <w:pPr>
+              <w:pStyle w:val="Compact"/>
+            </w:pPr>
+            <w:r>
+              <w:t xml:space="preserve">S2, bande 200 km/h</w:t>
+            </w:r>
+          </w:p>
+        </w:tc>
+        <w:tc>
+          <w:tcPr/>
+          <w:p>
+            <w:pPr>
+              <w:pStyle w:val="Compact"/>
+            </w:pPr>
+            <w:r>
+              <w:t xml:space="preserve">4 h 00</w:t>
+            </w:r>
+          </w:p>
+        </w:tc>
+        <w:tc>
+          <w:tcPr/>
+          <w:p>
+            <w:pPr>
+              <w:pStyle w:val="Compact"/>
+            </w:pPr>
+            <w:r>
+              <w:t xml:space="preserve">4 h 21 à 4 h 34</w:t>
+            </w:r>
+          </w:p>
+        </w:tc>
+      </w:tr>
+      <w:tr>
+        <w:tc>
+          <w:tcPr/>
+          <w:p>
+            <w:pPr>
+              <w:pStyle w:val="Compact"/>
+            </w:pPr>
+            <w:r>
+              <w:rPr>
+                <w:b/>
+                <w:bCs/>
+              </w:rPr>
+              <w:t xml:space="preserve">S3, bande 200 km/h</w:t>
+            </w:r>
+          </w:p>
+        </w:tc>
+        <w:tc>
+          <w:tcPr/>
+          <w:p>
+            <w:pPr>
+              <w:pStyle w:val="Compact"/>
+            </w:pPr>
+            <w:r>
+              <w:rPr>
+                <w:b/>
+                <w:bCs/>
+              </w:rPr>
+              <w:t xml:space="preserve">3 h 58</w:t>
+            </w:r>
+          </w:p>
+        </w:tc>
+        <w:tc>
+          <w:tcPr/>
+          <w:p>
+            <w:pPr>
+              <w:pStyle w:val="Compact"/>
+            </w:pPr>
+            <w:r>
+              <w:rPr>
+                <w:b/>
+                <w:bCs/>
+              </w:rPr>
+              <w:t xml:space="preserve">4 h 19 à 4 h 32</w:t>
+            </w:r>
+          </w:p>
+        </w:tc>
+      </w:tr>
+      <w:tr>
+        <w:tc>
+          <w:tcPr/>
+          <w:p>
+            <w:pPr>
+              <w:pStyle w:val="Compact"/>
+            </w:pPr>
+            <w:r>
+              <w:t xml:space="preserve">S3, bande 250 km/h (référence, exige zéro passage à niveau)</w:t>
+            </w:r>
+          </w:p>
+        </w:tc>
+        <w:tc>
+          <w:tcPr/>
+          <w:p>
+            <w:pPr>
+              <w:pStyle w:val="Compact"/>
+            </w:pPr>
+            <w:r>
+              <w:t xml:space="preserve">3 h 30</w:t>
+            </w:r>
+          </w:p>
+        </w:tc>
+        <w:tc>
+          <w:tcPr/>
+          <w:p>
+            <w:pPr>
+              <w:pStyle w:val="Compact"/>
+            </w:pPr>
+            <w:r>
+              <w:t xml:space="preserve">3 h 49 à 4 h 00</w:t>
+            </w:r>
+          </w:p>
+        </w:tc>
+      </w:tr>
+      <w:tr>
+        <w:tc>
+          <w:tcPr/>
+          <w:p>
+            <w:pPr>
+              <w:pStyle w:val="Compact"/>
+            </w:pPr>
+            <w:r>
+              <w:t xml:space="preserve">S3, bande 300 km/h (référence, idem + contrôle intégral)</w:t>
+            </w:r>
+          </w:p>
+        </w:tc>
+        <w:tc>
+          <w:tcPr/>
+          <w:p>
+            <w:pPr>
+              <w:pStyle w:val="Compact"/>
+            </w:pPr>
+            <w:r>
+              <w:t xml:space="preserve">3 h 15</w:t>
+            </w:r>
+          </w:p>
+        </w:tc>
+        <w:tc>
+          <w:tcPr/>
+          <w:p>
+            <w:pPr>
+              <w:pStyle w:val="Compact"/>
+            </w:pPr>
+            <w:r>
+              <w:t xml:space="preserve">3 h 32 à 3 h 43</w:t>
+            </w:r>
+          </w:p>
+        </w:tc>
+      </w:tr>
+    </w:tbl>
+    <w:p>
+      <w:pPr>
+        <w:pStyle w:val="BodyText"/>
+      </w:pPr>
+      <w:r>
+        <w:t xml:space="preserve">La combinaison cohérente avec le régime réglementaire actuel est</w:t>
+      </w:r>
+      <w:r>
+        <w:t xml:space="preserve"> </w:t>
+      </w:r>
+      <w:r>
+        <w:rPr>
+          <w:b/>
+          <w:bCs/>
+        </w:rPr>
+        <w:t xml:space="preserve">S3 à la bande</w:t>
+      </w:r>
+      <w:r>
+        <w:rPr>
+          <w:b/>
+          <w:bCs/>
+        </w:rPr>
+        <w:t xml:space="preserve"> </w:t>
+      </w:r>
+      <w:r>
+        <w:rPr>
+          <w:b/>
+          <w:bCs/>
+        </w:rPr>
+        <w:t xml:space="preserve">200 km/h</w:t>
+      </w:r>
+      <w:r>
+        <w:t xml:space="preserve"> : le meilleur train sur la voie existante, sans franchir le mur des</w:t>
+      </w:r>
+      <w:r>
+        <w:t xml:space="preserve"> </w:t>
+      </w:r>
+      <w:r>
+        <w:t xml:space="preserve">passages à niveau ni changer la signalisation au-delà du contrôle en cabine</w:t>
+      </w:r>
+      <w:r>
+        <w:t xml:space="preserve"> </w:t>
+      </w:r>
+      <w:r>
+        <w:t xml:space="preserve">(sections 5 et 6). Les bandes 250 et 300 sont des références : elles chiffrent ce</w:t>
+      </w:r>
+      <w:r>
+        <w:t xml:space="preserve"> </w:t>
+      </w:r>
+      <w:r>
+        <w:t xml:space="preserve">que l’élimination des passages et le contrôle intégral achèteraient en plus.</w:t>
+      </w:r>
+    </w:p>
+    <w:p>
+      <w:pPr>
+        <w:pStyle w:val="BodyText"/>
+      </w:pPr>
+      <w:r>
+        <w:rPr>
+          <w:b/>
+          <w:bCs/>
+        </w:rPr>
+        <w:t xml:space="preserve">Temps Montréal-Québec (270 km).</w:t>
+      </w:r>
+      <w:r>
+        <w:t xml:space="preserve"> </w:t>
+      </w:r>
+      <w:r>
+        <w:t xml:space="preserve">Horaire actuel : 3 h 23.</w:t>
       </w:r>
     </w:p>
     <w:tbl>
@@ -271,18 +545,18 @@
               <w:pStyle w:val="Compact"/>
             </w:pPr>
             <w:r>
-              <w:t xml:space="preserve">4 h 00</w:t>
-            </w:r>
-          </w:p>
-        </w:tc>
-        <w:tc>
-          <w:tcPr/>
-          <w:p>
-            <w:pPr>
-              <w:pStyle w:val="Compact"/>
-            </w:pPr>
-            <w:r>
-              <w:t xml:space="preserve">4 h 21 à 4 h 34</w:t>
+              <w:t xml:space="preserve">2 h 12</w:t>
+            </w:r>
+          </w:p>
+        </w:tc>
+        <w:tc>
+          <w:tcPr/>
+          <w:p>
+            <w:pPr>
+              <w:pStyle w:val="Compact"/>
+            </w:pPr>
+            <w:r>
+              <w:t xml:space="preserve">2 h 24 à 2 h 56</w:t>
             </w:r>
           </w:p>
         </w:tc>
@@ -295,29 +569,41 @@
               <w:pStyle w:val="Compact"/>
             </w:pPr>
             <w:r>
-              <w:t xml:space="preserve">S3, bande 250 km/h</w:t>
-            </w:r>
-          </w:p>
-        </w:tc>
-        <w:tc>
-          <w:tcPr/>
-          <w:p>
-            <w:pPr>
-              <w:pStyle w:val="Compact"/>
-            </w:pPr>
-            <w:r>
-              <w:t xml:space="preserve">3 h 30</w:t>
-            </w:r>
-          </w:p>
-        </w:tc>
-        <w:tc>
-          <w:tcPr/>
-          <w:p>
-            <w:pPr>
-              <w:pStyle w:val="Compact"/>
-            </w:pPr>
-            <w:r>
-              <w:t xml:space="preserve">3 h 49 à 4 h 00</w:t>
+              <w:rPr>
+                <w:b/>
+                <w:bCs/>
+              </w:rPr>
+              <w:t xml:space="preserve">S3, bande 200 km/h</w:t>
+            </w:r>
+          </w:p>
+        </w:tc>
+        <w:tc>
+          <w:tcPr/>
+          <w:p>
+            <w:pPr>
+              <w:pStyle w:val="Compact"/>
+            </w:pPr>
+            <w:r>
+              <w:rPr>
+                <w:b/>
+                <w:bCs/>
+              </w:rPr>
+              <w:t xml:space="preserve">2 h 08</w:t>
+            </w:r>
+          </w:p>
+        </w:tc>
+        <w:tc>
+          <w:tcPr/>
+          <w:p>
+            <w:pPr>
+              <w:pStyle w:val="Compact"/>
+            </w:pPr>
+            <w:r>
+              <w:rPr>
+                <w:b/>
+                <w:bCs/>
+              </w:rPr>
+              <w:t xml:space="preserve">2 h 20 à 2 h 50</w:t>
             </w:r>
           </w:p>
         </w:tc>
@@ -330,145 +616,7 @@
               <w:pStyle w:val="Compact"/>
             </w:pPr>
             <w:r>
-              <w:t xml:space="preserve">S3, bande 300 km/h</w:t>
-            </w:r>
-          </w:p>
-        </w:tc>
-        <w:tc>
-          <w:tcPr/>
-          <w:p>
-            <w:pPr>
-              <w:pStyle w:val="Compact"/>
-            </w:pPr>
-            <w:r>
-              <w:t xml:space="preserve">3 h 15</w:t>
-            </w:r>
-          </w:p>
-        </w:tc>
-        <w:tc>
-          <w:tcPr/>
-          <w:p>
-            <w:pPr>
-              <w:pStyle w:val="Compact"/>
-            </w:pPr>
-            <w:r>
-              <w:t xml:space="preserve">3 h 32 à 3 h 43</w:t>
-            </w:r>
-          </w:p>
-        </w:tc>
-      </w:tr>
-    </w:tbl>
-    <w:p>
-      <w:pPr>
-        <w:pStyle w:val="BodyText"/>
-      </w:pPr>
-      <w:r>
-        <w:rPr>
-          <w:b/>
-          <w:bCs/>
-        </w:rPr>
-        <w:t xml:space="preserve">Temps Montréal-Québec (270 km).</w:t>
-      </w:r>
-      <w:r>
-        <w:t xml:space="preserve"> </w:t>
-      </w:r>
-      <w:r>
-        <w:t xml:space="preserve">Horaire actuel : 3 h 23.</w:t>
-      </w:r>
-    </w:p>
-    <w:tbl>
-      <w:tblPr>
-        <w:tblStyle w:val="Table"/>
-        <w:tblW w:type="auto" w:w="0"/>
-        <w:tblLook w:firstRow="1" w:lastRow="0" w:firstColumn="0" w:lastColumn="0" w:noHBand="0" w:noVBand="0" w:val="0020"/>
-      </w:tblPr>
-      <w:tblGrid>
-        <w:gridCol w:w="2640"/>
-        <w:gridCol w:w="2640"/>
-        <w:gridCol w:w="2640"/>
-      </w:tblGrid>
-      <w:tr>
-        <w:trPr>
-          <w:tblHeader w:val="on"/>
-        </w:trPr>
-        <w:tc>
-          <w:tcPr/>
-          <w:p>
-            <w:pPr>
-              <w:pStyle w:val="Compact"/>
-            </w:pPr>
-            <w:r>
-              <w:t xml:space="preserve">Scénario × bande</w:t>
-            </w:r>
-          </w:p>
-        </w:tc>
-        <w:tc>
-          <w:tcPr/>
-          <w:p>
-            <w:pPr>
-              <w:pStyle w:val="Compact"/>
-            </w:pPr>
-            <w:r>
-              <w:t xml:space="preserve">Temps de base</w:t>
-            </w:r>
-          </w:p>
-        </w:tc>
-        <w:tc>
-          <w:tcPr/>
-          <w:p>
-            <w:pPr>
-              <w:pStyle w:val="Compact"/>
-            </w:pPr>
-            <w:r>
-              <w:t xml:space="preserve">Avec marge (fourchette)</w:t>
-            </w:r>
-          </w:p>
-        </w:tc>
-      </w:tr>
-      <w:tr>
-        <w:tc>
-          <w:tcPr/>
-          <w:p>
-            <w:pPr>
-              <w:pStyle w:val="Compact"/>
-            </w:pPr>
-            <w:r>
-              <w:t xml:space="preserve">S2, bande 200 km/h</w:t>
-            </w:r>
-          </w:p>
-        </w:tc>
-        <w:tc>
-          <w:tcPr/>
-          <w:p>
-            <w:pPr>
-              <w:pStyle w:val="Compact"/>
-            </w:pPr>
-            <w:r>
-              <w:t xml:space="preserve">2 h 12</w:t>
-            </w:r>
-          </w:p>
-        </w:tc>
-        <w:tc>
-          <w:tcPr/>
-          <w:p>
-            <w:pPr>
-              <w:pStyle w:val="Compact"/>
-            </w:pPr>
-            <w:r>
-              <w:t xml:space="preserve">2 h 24 à 2 h 56</w:t>
-            </w:r>
-          </w:p>
-        </w:tc>
-      </w:tr>
-      <w:tr>
-        <w:tc>
-          <w:tcPr/>
-          <w:p>
-            <w:pPr>
-              <w:pStyle w:val="Compact"/>
-            </w:pPr>
-            <w:r>
-              <w:t xml:space="preserve">S3, bande 250 km/h</w:t>
+              <w:t xml:space="preserve">S3, bande 250 km/h (référence)</w:t>
             </w:r>
           </w:p>
         </w:tc>
@@ -4167,12 +4315,13 @@
         <w:tblLook w:firstRow="1" w:lastRow="0" w:firstColumn="0" w:lastColumn="0" w:noHBand="0" w:noVBand="0" w:val="0020"/>
       </w:tblPr>
       <w:tblGrid>
-        <w:gridCol w:w="1320"/>
-        <w:gridCol w:w="1320"/>
-        <w:gridCol w:w="1320"/>
-        <w:gridCol w:w="1320"/>
-        <w:gridCol w:w="1320"/>
-        <w:gridCol w:w="1320"/>
+        <w:gridCol w:w="1131"/>
+        <w:gridCol w:w="1131"/>
+        <w:gridCol w:w="1131"/>
+        <w:gridCol w:w="1131"/>
+        <w:gridCol w:w="1131"/>
+        <w:gridCol w:w="1131"/>
+        <w:gridCol w:w="1131"/>
       </w:tblGrid>
       <w:tr>
         <w:trPr>
@@ -4229,6 +4378,17 @@
               <w:pStyle w:val="Compact"/>
             </w:pPr>
             <w:r>
+              <w:t xml:space="preserve">S3, 200</w:t>
+            </w:r>
+          </w:p>
+        </w:tc>
+        <w:tc>
+          <w:tcPr/>
+          <w:p>
+            <w:pPr>
+              <w:pStyle w:val="Compact"/>
+            </w:pPr>
+            <w:r>
               <w:t xml:space="preserve">S3, 250</w:t>
             </w:r>
           </w:p>
@@ -4297,6 +4457,17 @@
               <w:pStyle w:val="Compact"/>
             </w:pPr>
             <w:r>
+              <w:t xml:space="preserve">2 h 08</w:t>
+            </w:r>
+          </w:p>
+        </w:tc>
+        <w:tc>
+          <w:tcPr/>
+          <w:p>
+            <w:pPr>
+              <w:pStyle w:val="Compact"/>
+            </w:pPr>
+            <w:r>
               <w:t xml:space="preserve">1 h 58</w:t>
             </w:r>
           </w:p>
@@ -4365,6 +4536,17 @@
               <w:pStyle w:val="Compact"/>
             </w:pPr>
             <w:r>
+              <w:t xml:space="preserve">1 h 31</w:t>
+            </w:r>
+          </w:p>
+        </w:tc>
+        <w:tc>
+          <w:tcPr/>
+          <w:p>
+            <w:pPr>
+              <w:pStyle w:val="Compact"/>
+            </w:pPr>
+            <w:r>
               <w:t xml:space="preserve">1 h 24</w:t>
             </w:r>
           </w:p>
@@ -4433,6 +4615,17 @@
               <w:pStyle w:val="Compact"/>
             </w:pPr>
             <w:r>
+              <w:t xml:space="preserve">3 h 19</w:t>
+            </w:r>
+          </w:p>
+        </w:tc>
+        <w:tc>
+          <w:tcPr/>
+          <w:p>
+            <w:pPr>
+              <w:pStyle w:val="Compact"/>
+            </w:pPr>
+            <w:r>
               <w:t xml:space="preserve">2 h 56</w:t>
             </w:r>
           </w:p>
@@ -4491,6 +4684,17 @@
             </w:pPr>
             <w:r>
               <w:t xml:space="preserve">4 h 00</w:t>
+            </w:r>
+          </w:p>
+        </w:tc>
+        <w:tc>
+          <w:tcPr/>
+          <w:p>
+            <w:pPr>
+              <w:pStyle w:val="Compact"/>
+            </w:pPr>
+            <w:r>
+              <w:t xml:space="preserve">3 h 58</w:t>
             </w:r>
           </w:p>
         </w:tc>

</xml_diff>

<commit_message>
Figure « train contre auto » (idée Vincent) insérée en synthèse
Barres MTL-QC / MTL-TO : auto (repère approx.), VIA actuel, S2@200, S3@300,
fourchettes en moustache, % de l'auto en étiquette. VIA perd aujourd'hui
contre l'auto sur MTL-QC (119 %) ; S2 passe devant (94/81 %), S3 creuse
(80/66 %). Étiquettes déplacées après la borne haute.

Co-Authored-By: Claude Fable 5 <noreply@anthropic.com>
Claude-Session: https://claude.ai/code/session_01UAqHM1ry5Ckx2YL5NLcNpH
</commit_message>
<xml_diff>
--- a/livrables/rapport_corridor_BROUILLON.docx
+++ b/livrables/rapport_corridor_BROUILLON.docx
@@ -34,7 +34,7 @@
         <w:t xml:space="preserve">Brouillon, août 2026</w:t>
       </w:r>
     </w:p>
-    <w:bookmarkStart w:id="9" w:name="synthèse"/>
+    <w:bookmarkStart w:id="12" w:name="synthèse"/>
     <w:p>
       <w:pPr>
         <w:pStyle w:val="Heading1"/>
@@ -408,6 +408,61 @@
     </w:tbl>
     <w:p>
       <w:pPr>
+        <w:pStyle w:val="CaptionedFigure"/>
+      </w:pPr>
+      <w:r>
+        <w:drawing>
+          <wp:inline>
+            <wp:extent cx="5334000" cy="1917380"/>
+            <wp:effectExtent b="0" l="0" r="0" t="0"/>
+            <wp:docPr descr="Le train contre l’auto (temps auto : approximation de connaissance générale). Aujourd’hui, le train perd contre l’auto sur Montréal-Québec ; dès S2 il passe devant, et S3 à 300 la met à 20 et 34 pour cent derrière." title="" id="10" name="Picture"/>
+            <a:graphic>
+              <a:graphicData uri="http://schemas.openxmlformats.org/drawingml/2006/picture">
+                <pic:pic>
+                  <pic:nvPicPr>
+                    <pic:cNvPr descr="livrables/figure_vs_auto.png" id="11" name="Picture"/>
+                    <pic:cNvPicPr>
+                      <a:picLocks noChangeArrowheads="1" noChangeAspect="1"/>
+                    </pic:cNvPicPr>
+                  </pic:nvPicPr>
+                  <pic:blipFill>
+                    <a:blip r:embed="rId9"/>
+                    <a:stretch>
+                      <a:fillRect/>
+                    </a:stretch>
+                  </pic:blipFill>
+                  <pic:spPr bwMode="auto">
+                    <a:xfrm>
+                      <a:off x="0" y="0"/>
+                      <a:ext cx="5334000" cy="1917380"/>
+                    </a:xfrm>
+                    <a:prstGeom prst="rect">
+                      <a:avLst/>
+                    </a:prstGeom>
+                    <a:noFill/>
+                    <a:ln w="9525">
+                      <a:noFill/>
+                      <a:headEnd/>
+                      <a:tailEnd/>
+                    </a:ln>
+                  </pic:spPr>
+                </pic:pic>
+              </a:graphicData>
+            </a:graphic>
+          </wp:inline>
+        </w:drawing>
+      </w:r>
+    </w:p>
+    <w:p>
+      <w:pPr>
+        <w:pStyle w:val="ImageCaption"/>
+      </w:pPr>
+      <w:r>
+        <w:t xml:space="preserve">Le train contre l’auto (temps auto : approximation de connaissance générale). Aujourd’hui, le train perd contre l’auto sur Montréal-Québec ; dès S2 il passe devant, et S3 à 300 la met à 20 et 34 pour cent derrière.</w:t>
+      </w:r>
+    </w:p>
+    <w:p>
+      <w:pPr>
         <w:pStyle w:val="BodyText"/>
       </w:pPr>
       <w:r>
@@ -1024,8 +1079,8 @@
         <w:t xml:space="preserve">circulation avec le propriétaire de la voie devra allouer.</w:t>
       </w:r>
     </w:p>
-    <w:bookmarkEnd w:id="9"/>
-    <w:bookmarkStart w:id="13" w:name="méthode-et-périmètre"/>
+    <w:bookmarkEnd w:id="12"/>
+    <w:bookmarkStart w:id="16" w:name="méthode-et-périmètre"/>
     <w:p>
       <w:pPr>
         <w:pStyle w:val="Heading1"/>
@@ -1034,7 +1089,7 @@
         <w:t xml:space="preserve">Méthode et périmètre</w:t>
       </w:r>
     </w:p>
-    <w:bookmarkStart w:id="10" w:name="le-modèle"/>
+    <w:bookmarkStart w:id="13" w:name="le-modèle"/>
     <w:p>
       <w:pPr>
         <w:pStyle w:val="Heading2"/>
@@ -1560,8 +1615,8 @@
         <w:t xml:space="preserve">(section 4.3).</w:t>
       </w:r>
     </w:p>
-    <w:bookmarkEnd w:id="10"/>
-    <w:bookmarkStart w:id="11" w:name="les-données"/>
+    <w:bookmarkEnd w:id="13"/>
+    <w:bookmarkStart w:id="14" w:name="les-données"/>
     <w:p>
       <w:pPr>
         <w:pStyle w:val="Heading2"/>
@@ -1680,8 +1735,8 @@
         <w:t xml:space="preserve">saison 2026.</w:t>
       </w:r>
     </w:p>
-    <w:bookmarkEnd w:id="11"/>
-    <w:bookmarkStart w:id="12" w:name="hors-périmètre-déclaré"/>
+    <w:bookmarkEnd w:id="14"/>
+    <w:bookmarkStart w:id="15" w:name="hors-périmètre-déclaré"/>
     <w:p>
       <w:pPr>
         <w:pStyle w:val="Heading2"/>
@@ -1748,9 +1803,9 @@
         <w:t xml:space="preserve">compte.</w:t>
       </w:r>
     </w:p>
-    <w:bookmarkEnd w:id="12"/>
-    <w:bookmarkEnd w:id="13"/>
-    <w:bookmarkStart w:id="14" w:name="le-train-pendulaire-et-le-dévers"/>
+    <w:bookmarkEnd w:id="15"/>
+    <w:bookmarkEnd w:id="16"/>
+    <w:bookmarkStart w:id="17" w:name="le-train-pendulaire-et-le-dévers"/>
     <w:p>
       <w:pPr>
         <w:pStyle w:val="Heading1"/>
@@ -2482,8 +2537,8 @@
         <w:t xml:space="preserve">l’argumentaire : tout y tient dans la méthode que le CN applique déjà.</w:t>
       </w:r>
     </w:p>
-    <w:bookmarkEnd w:id="14"/>
-    <w:bookmarkStart w:id="21" w:name="X42a82ebb192afdbd87b7e7f59c353876bbe630b"/>
+    <w:bookmarkEnd w:id="17"/>
+    <w:bookmarkStart w:id="24" w:name="X42a82ebb192afdbd87b7e7f59c353876bbe630b"/>
     <w:p>
       <w:pPr>
         <w:pStyle w:val="Heading1"/>
@@ -2536,7 +2591,7 @@
         <w:t xml:space="preserve">et le prix du régime.</w:t>
       </w:r>
     </w:p>
-    <w:bookmarkStart w:id="18" w:name="la-mesure"/>
+    <w:bookmarkStart w:id="21" w:name="la-mesure"/>
     <w:p>
       <w:pPr>
         <w:pStyle w:val="Heading2"/>
@@ -2844,18 +2899,18 @@
           <wp:inline>
             <wp:extent cx="5334000" cy="3067855"/>
             <wp:effectExtent b="0" l="0" r="0" t="0"/>
-            <wp:docPr descr="Le 2×2 du corridor : chaque inter-gare colorée selon sa cellule voie × propriétaire, avec la marge médiane mesurée par cellule. En gris, les paires exclues de la mesure (blocs urbains, ponts, frontières de propriétaire)." title="" id="16" name="Picture"/>
+            <wp:docPr descr="Le 2×2 du corridor : chaque inter-gare colorée selon sa cellule voie × propriétaire, avec la marge médiane mesurée par cellule. En gris, les paires exclues de la mesure (blocs urbains, ponts, frontières de propriétaire)." title="" id="19" name="Picture"/>
             <a:graphic>
               <a:graphicData uri="http://schemas.openxmlformats.org/drawingml/2006/picture">
                 <pic:pic>
                   <pic:nvPicPr>
-                    <pic:cNvPr descr="livrables/figure_cellules.png" id="17" name="Picture"/>
+                    <pic:cNvPr descr="livrables/figure_cellules.png" id="20" name="Picture"/>
                     <pic:cNvPicPr>
                       <a:picLocks noChangeArrowheads="1" noChangeAspect="1"/>
                     </pic:cNvPicPr>
                   </pic:nvPicPr>
                   <pic:blipFill>
-                    <a:blip r:embed="rId15"/>
+                    <a:blip r:embed="rId18"/>
                     <a:stretch>
                       <a:fillRect/>
                     </a:stretch>
@@ -3048,8 +3103,8 @@
         <w:t xml:space="preserve">jusqu’à 24 minutes selon l’heure de son départ.</w:t>
       </w:r>
     </w:p>
-    <w:bookmarkEnd w:id="18"/>
-    <w:bookmarkStart w:id="19" w:name="contre-épreuve-le-sud-ouest-ontarien"/>
+    <w:bookmarkEnd w:id="21"/>
+    <w:bookmarkStart w:id="22" w:name="contre-épreuve-le-sud-ouest-ontarien"/>
     <w:p>
       <w:pPr>
         <w:pStyle w:val="Heading2"/>
@@ -3114,8 +3169,8 @@
         <w:t xml:space="preserve">la conclusion du cœur se réplique dans une seconde région, par un autre mécanisme.</w:t>
       </w:r>
     </w:p>
-    <w:bookmarkEnd w:id="19"/>
-    <w:bookmarkStart w:id="20" w:name="lencadrement-de-la-marge"/>
+    <w:bookmarkEnd w:id="22"/>
+    <w:bookmarkStart w:id="23" w:name="lencadrement-de-la-marge"/>
     <w:p>
       <w:pPr>
         <w:pStyle w:val="Heading2"/>
@@ -3581,9 +3636,9 @@
         <w:t xml:space="preserve">circulation.</w:t>
       </w:r>
     </w:p>
-    <w:bookmarkEnd w:id="20"/>
-    <w:bookmarkEnd w:id="21"/>
-    <w:bookmarkStart w:id="22" w:name="passages-à-niveau"/>
+    <w:bookmarkEnd w:id="23"/>
+    <w:bookmarkEnd w:id="24"/>
+    <w:bookmarkStart w:id="25" w:name="passages-à-niveau"/>
     <w:p>
       <w:pPr>
         <w:pStyle w:val="Heading1"/>
@@ -4097,8 +4152,8 @@
         <w:t xml:space="preserve">traitement standard ; 122 passages urbains, multi-voies ou provinciaux, complexes.</w:t>
       </w:r>
     </w:p>
-    <w:bookmarkEnd w:id="22"/>
-    <w:bookmarkStart w:id="23" w:name="signalisation"/>
+    <w:bookmarkEnd w:id="25"/>
+    <w:bookmarkStart w:id="26" w:name="signalisation"/>
     <w:p>
       <w:pPr>
         <w:pStyle w:val="Heading1"/>
@@ -4283,8 +4338,8 @@
         <w:t xml:space="preserve">ne dimensionne pas.</w:t>
       </w:r>
     </w:p>
-    <w:bookmarkEnd w:id="23"/>
-    <w:bookmarkStart w:id="24" w:name="résultats-intégrés"/>
+    <w:bookmarkEnd w:id="26"/>
+    <w:bookmarkStart w:id="27" w:name="résultats-intégrés"/>
     <w:p>
       <w:pPr>
         <w:pStyle w:val="Heading1"/>
@@ -4774,8 +4829,8 @@
         <w:t xml:space="preserve">correctement à chaque régénération.</w:t>
       </w:r>
     </w:p>
-    <w:bookmarkEnd w:id="24"/>
-    <w:bookmarkStart w:id="25" w:name="limites-et-létude-quil-faut-commander"/>
+    <w:bookmarkEnd w:id="27"/>
+    <w:bookmarkStart w:id="28" w:name="limites-et-létude-quil-faut-commander"/>
     <w:p>
       <w:pPr>
         <w:pStyle w:val="Heading1"/>
@@ -4860,8 +4915,8 @@
         <w:t xml:space="preserve">bornent d’avance le résultat.</w:t>
       </w:r>
     </w:p>
-    <w:bookmarkEnd w:id="25"/>
-    <w:bookmarkStart w:id="71" w:name="références"/>
+    <w:bookmarkEnd w:id="28"/>
+    <w:bookmarkStart w:id="74" w:name="références"/>
     <w:p>
       <w:pPr>
         <w:pStyle w:val="Heading1"/>
@@ -4870,8 +4925,8 @@
         <w:t xml:space="preserve">Références</w:t>
       </w:r>
     </w:p>
-    <w:bookmarkStart w:id="70" w:name="refs"/>
-    <w:bookmarkStart w:id="27" w:name="ref-alto2025"/>
+    <w:bookmarkStart w:id="73" w:name="refs"/>
+    <w:bookmarkStart w:id="30" w:name="ref-alto2025"/>
     <w:p>
       <w:pPr>
         <w:pStyle w:val="Bibliography"/>
@@ -4895,7 +4950,7 @@
       <w:r>
         <w:t xml:space="preserve"> </w:t>
       </w:r>
-      <w:hyperlink r:id="rId26">
+      <w:hyperlink r:id="rId29">
         <w:r>
           <w:rPr>
             <w:rStyle w:val="Hyperlink"/>
@@ -4904,8 +4959,8 @@
         </w:r>
       </w:hyperlink>
     </w:p>
-    <w:bookmarkEnd w:id="27"/>
-    <w:bookmarkStart w:id="29" w:name="ref-amtrakoig2019"/>
+    <w:bookmarkEnd w:id="30"/>
+    <w:bookmarkStart w:id="32" w:name="ref-amtrakoig2019"/>
     <w:p>
       <w:pPr>
         <w:pStyle w:val="Bibliography"/>
@@ -4932,7 +4987,7 @@
       <w:r>
         <w:t xml:space="preserve"> </w:t>
       </w:r>
-      <w:hyperlink r:id="rId28">
+      <w:hyperlink r:id="rId31">
         <w:r>
           <w:rPr>
             <w:rStyle w:val="Hyperlink"/>
@@ -4941,8 +4996,8 @@
         </w:r>
       </w:hyperlink>
     </w:p>
-    <w:bookmarkEnd w:id="29"/>
-    <w:bookmarkStart w:id="31" w:name="ref-canadianrail1976"/>
+    <w:bookmarkEnd w:id="32"/>
+    <w:bookmarkStart w:id="34" w:name="ref-canadianrail1976"/>
     <w:p>
       <w:pPr>
         <w:pStyle w:val="Bibliography"/>
@@ -4966,7 +5021,7 @@
       <w:r>
         <w:t xml:space="preserve"> </w:t>
       </w:r>
-      <w:hyperlink r:id="rId30">
+      <w:hyperlink r:id="rId33">
         <w:r>
           <w:rPr>
             <w:rStyle w:val="Hyperlink"/>
@@ -4975,8 +5030,8 @@
         </w:r>
       </w:hyperlink>
     </w:p>
-    <w:bookmarkEnd w:id="31"/>
-    <w:bookmarkStart w:id="33" w:name="ref-bateman2015"/>
+    <w:bookmarkEnd w:id="34"/>
+    <w:bookmarkStart w:id="36" w:name="ref-bateman2015"/>
     <w:p>
       <w:pPr>
         <w:pStyle w:val="Bibliography"/>
@@ -5028,7 +5083,7 @@
       <w:r>
         <w:t xml:space="preserve"> </w:t>
       </w:r>
-      <w:hyperlink r:id="rId32">
+      <w:hyperlink r:id="rId35">
         <w:r>
           <w:rPr>
             <w:rStyle w:val="Hyperlink"/>
@@ -5037,8 +5092,8 @@
         </w:r>
       </w:hyperlink>
     </w:p>
-    <w:bookmarkEnd w:id="33"/>
-    <w:bookmarkStart w:id="35" w:name="ref-bienaime2009sealed"/>
+    <w:bookmarkEnd w:id="36"/>
+    <w:bookmarkStart w:id="38" w:name="ref-bienaime2009sealed"/>
     <w:p>
       <w:pPr>
         <w:pStyle w:val="Bibliography"/>
@@ -5121,7 +5176,7 @@
       <w:r>
         <w:t xml:space="preserve"> </w:t>
       </w:r>
-      <w:hyperlink r:id="rId34">
+      <w:hyperlink r:id="rId37">
         <w:r>
           <w:rPr>
             <w:rStyle w:val="Hyperlink"/>
@@ -5130,8 +5185,8 @@
         </w:r>
       </w:hyperlink>
     </w:p>
-    <w:bookmarkEnd w:id="35"/>
-    <w:bookmarkStart w:id="36" w:name="ref-cn2002mr1305"/>
+    <w:bookmarkEnd w:id="38"/>
+    <w:bookmarkStart w:id="39" w:name="ref-cn2002mr1305"/>
     <w:p>
       <w:pPr>
         <w:pStyle w:val="Bibliography"/>
@@ -5156,8 +5211,8 @@
         <w:t xml:space="preserve">[Circulaire technique interne]. Compagnie des chemins de fer nationaux du Canada.</w:t>
       </w:r>
     </w:p>
-    <w:bookmarkEnd w:id="36"/>
-    <w:bookmarkStart w:id="38" w:name="ref-cbc2025pilote"/>
+    <w:bookmarkEnd w:id="39"/>
+    <w:bookmarkStart w:id="41" w:name="ref-cbc2025pilote"/>
     <w:p>
       <w:pPr>
         <w:pStyle w:val="Bibliography"/>
@@ -5209,7 +5264,7 @@
       <w:r>
         <w:t xml:space="preserve"> </w:t>
       </w:r>
-      <w:hyperlink r:id="rId37">
+      <w:hyperlink r:id="rId40">
         <w:r>
           <w:rPr>
             <w:rStyle w:val="Hyperlink"/>
@@ -5218,8 +5273,8 @@
         </w:r>
       </w:hyperlink>
     </w:p>
-    <w:bookmarkEnd w:id="38"/>
-    <w:bookmarkStart w:id="40" w:name="ref-ecfr213-347"/>
+    <w:bookmarkEnd w:id="41"/>
+    <w:bookmarkStart w:id="43" w:name="ref-ecfr213-347"/>
     <w:p>
       <w:pPr>
         <w:pStyle w:val="Bibliography"/>
@@ -5243,7 +5298,7 @@
       <w:r>
         <w:t xml:space="preserve"> </w:t>
       </w:r>
-      <w:hyperlink r:id="rId39">
+      <w:hyperlink r:id="rId42">
         <w:r>
           <w:rPr>
             <w:rStyle w:val="Hyperlink"/>
@@ -5252,8 +5307,8 @@
         </w:r>
       </w:hyperlink>
     </w:p>
-    <w:bookmarkEnd w:id="40"/>
-    <w:bookmarkStart w:id="42" w:name="ref-fra-lrc-152"/>
+    <w:bookmarkEnd w:id="43"/>
+    <w:bookmarkStart w:id="45" w:name="ref-fra-lrc-152"/>
     <w:p>
       <w:pPr>
         <w:pStyle w:val="Bibliography"/>
@@ -5277,7 +5332,7 @@
       <w:r>
         <w:t xml:space="preserve"> </w:t>
       </w:r>
-      <w:hyperlink r:id="rId41">
+      <w:hyperlink r:id="rId44">
         <w:r>
           <w:rPr>
             <w:rStyle w:val="Hyperlink"/>
@@ -5286,8 +5341,8 @@
         </w:r>
       </w:hyperlink>
     </w:p>
-    <w:bookmarkEnd w:id="42"/>
-    <w:bookmarkStart w:id="44" w:name="ref-fra2024itcs"/>
+    <w:bookmarkEnd w:id="45"/>
+    <w:bookmarkStart w:id="47" w:name="ref-fra2024itcs"/>
     <w:p>
       <w:pPr>
         <w:pStyle w:val="Bibliography"/>
@@ -5311,7 +5366,7 @@
       <w:r>
         <w:t xml:space="preserve"> </w:t>
       </w:r>
-      <w:hyperlink r:id="rId43">
+      <w:hyperlink r:id="rId46">
         <w:r>
           <w:rPr>
             <w:rStyle w:val="Hyperlink"/>
@@ -5320,8 +5375,8 @@
         </w:r>
       </w:hyperlink>
     </w:p>
-    <w:bookmarkEnd w:id="44"/>
-    <w:bookmarkStart w:id="46" w:name="ref-via2024requete"/>
+    <w:bookmarkEnd w:id="47"/>
+    <w:bookmarkStart w:id="49" w:name="ref-via2024requete"/>
     <w:p>
       <w:pPr>
         <w:pStyle w:val="Bibliography"/>
@@ -5373,7 +5428,7 @@
       <w:r>
         <w:t xml:space="preserve"> </w:t>
       </w:r>
-      <w:hyperlink r:id="rId45">
+      <w:hyperlink r:id="rId48">
         <w:r>
           <w:rPr>
             <w:rStyle w:val="Hyperlink"/>
@@ -5382,8 +5437,8 @@
         </w:r>
       </w:hyperlink>
     </w:p>
-    <w:bookmarkEnd w:id="46"/>
-    <w:bookmarkStart w:id="48" w:name="ref-osm2026geofabrik"/>
+    <w:bookmarkEnd w:id="49"/>
+    <w:bookmarkStart w:id="51" w:name="ref-osm2026geofabrik"/>
     <w:p>
       <w:pPr>
         <w:pStyle w:val="Bibliography"/>
@@ -5449,7 +5504,7 @@
       <w:r>
         <w:t xml:space="preserve"> </w:t>
       </w:r>
-      <w:hyperlink r:id="rId47">
+      <w:hyperlink r:id="rId50">
         <w:r>
           <w:rPr>
             <w:rStyle w:val="Hyperlink"/>
@@ -5458,8 +5513,8 @@
         </w:r>
       </w:hyperlink>
     </w:p>
-    <w:bookmarkEnd w:id="48"/>
-    <w:bookmarkStart w:id="50" w:name="ref-schittenhelm2011"/>
+    <w:bookmarkEnd w:id="51"/>
+    <w:bookmarkStart w:id="53" w:name="ref-schittenhelm2011"/>
     <w:p>
       <w:pPr>
         <w:pStyle w:val="Bibliography"/>
@@ -5483,7 +5538,7 @@
       <w:r>
         <w:t xml:space="preserve"> </w:t>
       </w:r>
-      <w:hyperlink r:id="rId49">
+      <w:hyperlink r:id="rId52">
         <w:r>
           <w:rPr>
             <w:rStyle w:val="Hyperlink"/>
@@ -5492,8 +5547,8 @@
         </w:r>
       </w:hyperlink>
     </w:p>
-    <w:bookmarkEnd w:id="50"/>
-    <w:bookmarkStart w:id="52" w:name="ref-sncf2023drr"/>
+    <w:bookmarkEnd w:id="53"/>
+    <w:bookmarkStart w:id="55" w:name="ref-sncf2023drr"/>
     <w:p>
       <w:pPr>
         <w:pStyle w:val="Bibliography"/>
@@ -5517,7 +5572,7 @@
       <w:r>
         <w:t xml:space="preserve"> </w:t>
       </w:r>
-      <w:hyperlink r:id="rId51">
+      <w:hyperlink r:id="rId54">
         <w:r>
           <w:rPr>
             <w:rStyle w:val="Hyperlink"/>
@@ -5526,8 +5581,8 @@
         </w:r>
       </w:hyperlink>
     </w:p>
-    <w:bookmarkEnd w:id="52"/>
-    <w:bookmarkStart w:id="54" w:name="ref-trafikverket2025jnb"/>
+    <w:bookmarkEnd w:id="55"/>
+    <w:bookmarkStart w:id="57" w:name="ref-trafikverket2025jnb"/>
     <w:p>
       <w:pPr>
         <w:pStyle w:val="Bibliography"/>
@@ -5551,7 +5606,7 @@
       <w:r>
         <w:t xml:space="preserve"> </w:t>
       </w:r>
-      <w:hyperlink r:id="rId53">
+      <w:hyperlink r:id="rId56">
         <w:r>
           <w:rPr>
             <w:rStyle w:val="Hyperlink"/>
@@ -5560,8 +5615,8 @@
         </w:r>
       </w:hyperlink>
     </w:p>
-    <w:bookmarkEnd w:id="54"/>
-    <w:bookmarkStart w:id="56" w:name="ref-tc2022rrts"/>
+    <w:bookmarkEnd w:id="57"/>
+    <w:bookmarkStart w:id="59" w:name="ref-tc2022rrts"/>
     <w:p>
       <w:pPr>
         <w:pStyle w:val="Bibliography"/>
@@ -5599,7 +5654,7 @@
       <w:r>
         <w:t xml:space="preserve"> </w:t>
       </w:r>
-      <w:hyperlink r:id="rId55">
+      <w:hyperlink r:id="rId58">
         <w:r>
           <w:rPr>
             <w:rStyle w:val="Hyperlink"/>
@@ -5608,8 +5663,8 @@
         </w:r>
       </w:hyperlink>
     </w:p>
-    <w:bookmarkEnd w:id="56"/>
-    <w:bookmarkStart w:id="58" w:name="ref-tc2023inventairepn"/>
+    <w:bookmarkEnd w:id="59"/>
+    <w:bookmarkStart w:id="61" w:name="ref-tc2023inventairepn"/>
     <w:p>
       <w:pPr>
         <w:pStyle w:val="Bibliography"/>
@@ -5633,7 +5688,7 @@
       <w:r>
         <w:t xml:space="preserve"> </w:t>
       </w:r>
-      <w:hyperlink r:id="rId57">
+      <w:hyperlink r:id="rId60">
         <w:r>
           <w:rPr>
             <w:rStyle w:val="Hyperlink"/>
@@ -5642,8 +5697,8 @@
         </w:r>
       </w:hyperlink>
     </w:p>
-    <w:bookmarkEnd w:id="58"/>
-    <w:bookmarkStart w:id="60" w:name="ref-tc2025gcp"/>
+    <w:bookmarkEnd w:id="61"/>
+    <w:bookmarkStart w:id="63" w:name="ref-tc2025gcp"/>
     <w:p>
       <w:pPr>
         <w:pStyle w:val="Bibliography"/>
@@ -5751,7 +5806,7 @@
       <w:r>
         <w:t xml:space="preserve"> </w:t>
       </w:r>
-      <w:hyperlink r:id="rId59">
+      <w:hyperlink r:id="rId62">
         <w:r>
           <w:rPr>
             <w:rStyle w:val="Hyperlink"/>
@@ -5760,8 +5815,8 @@
         </w:r>
       </w:hyperlink>
     </w:p>
-    <w:bookmarkEnd w:id="60"/>
-    <w:bookmarkStart w:id="61" w:name="ref-uic2000f451"/>
+    <w:bookmarkEnd w:id="63"/>
+    <w:bookmarkStart w:id="64" w:name="ref-uic2000f451"/>
     <w:p>
       <w:pPr>
         <w:pStyle w:val="Bibliography"/>
@@ -5786,8 +5841,8 @@
         <w:t xml:space="preserve">[Fiche UIC 451-1/F/4, 4e \'ed.]. UIC.</w:t>
       </w:r>
     </w:p>
-    <w:bookmarkEnd w:id="61"/>
-    <w:bookmarkStart w:id="63" w:name="ref-via2009lrc"/>
+    <w:bookmarkEnd w:id="64"/>
+    <w:bookmarkStart w:id="66" w:name="ref-via2009lrc"/>
     <w:p>
       <w:pPr>
         <w:pStyle w:val="Bibliography"/>
@@ -5832,7 +5887,7 @@
       <w:r>
         <w:t xml:space="preserve"> </w:t>
       </w:r>
-      <w:hyperlink r:id="rId62">
+      <w:hyperlink r:id="rId65">
         <w:r>
           <w:rPr>
             <w:rStyle w:val="Hyperlink"/>
@@ -5841,8 +5896,8 @@
         </w:r>
       </w:hyperlink>
     </w:p>
-    <w:bookmarkEnd w:id="63"/>
-    <w:bookmarkStart w:id="65" w:name="ref-via2025rapportannuel"/>
+    <w:bookmarkEnd w:id="66"/>
+    <w:bookmarkStart w:id="68" w:name="ref-via2025rapportannuel"/>
     <w:p>
       <w:pPr>
         <w:pStyle w:val="Bibliography"/>
@@ -5866,7 +5921,7 @@
       <w:r>
         <w:t xml:space="preserve"> </w:t>
       </w:r>
-      <w:hyperlink r:id="rId64">
+      <w:hyperlink r:id="rId67">
         <w:r>
           <w:rPr>
             <w:rStyle w:val="Hyperlink"/>
@@ -5875,8 +5930,8 @@
         </w:r>
       </w:hyperlink>
     </w:p>
-    <w:bookmarkEnd w:id="65"/>
-    <w:bookmarkStart w:id="67" w:name="ref-via2025t1"/>
+    <w:bookmarkEnd w:id="68"/>
+    <w:bookmarkStart w:id="70" w:name="ref-via2025t1"/>
     <w:p>
       <w:pPr>
         <w:pStyle w:val="Bibliography"/>
@@ -5900,7 +5955,7 @@
       <w:r>
         <w:t xml:space="preserve"> </w:t>
       </w:r>
-      <w:hyperlink r:id="rId66">
+      <w:hyperlink r:id="rId69">
         <w:r>
           <w:rPr>
             <w:rStyle w:val="Hyperlink"/>
@@ -5909,8 +5964,8 @@
         </w:r>
       </w:hyperlink>
     </w:p>
-    <w:bookmarkEnd w:id="67"/>
-    <w:bookmarkStart w:id="69" w:name="ref-viarail2026gtfs"/>
+    <w:bookmarkEnd w:id="70"/>
+    <w:bookmarkStart w:id="72" w:name="ref-viarail2026gtfs"/>
     <w:p>
       <w:pPr>
         <w:pStyle w:val="Bibliography"/>
@@ -5976,7 +6031,7 @@
       <w:r>
         <w:t xml:space="preserve"> </w:t>
       </w:r>
-      <w:hyperlink r:id="rId68">
+      <w:hyperlink r:id="rId71">
         <w:r>
           <w:rPr>
             <w:rStyle w:val="Hyperlink"/>
@@ -5985,9 +6040,9 @@
         </w:r>
       </w:hyperlink>
     </w:p>
-    <w:bookmarkEnd w:id="69"/>
-    <w:bookmarkEnd w:id="70"/>
-    <w:bookmarkEnd w:id="71"/>
+    <w:bookmarkEnd w:id="72"/>
+    <w:bookmarkEnd w:id="73"/>
+    <w:bookmarkEnd w:id="74"/>
     <w:sectPr>
       <w:footnotePr>
         <w:numRestart w:val="eachSect"/>

</xml_diff>